<commit_message>
Answer doc: keep only Part II (Q5-Q8) additions; Part I left for the group
Co-Authored-By: Claude Opus 5.5 <noreply@anthropic.com>
Claude-Session: https://claude.ai/code/session_01Xyn5UReDnprMGbhYAQvGPE
</commit_message>
<xml_diff>
--- a/econ385/Long_Set_1_Answers.docx
+++ b/econ385/Long_Set_1_Answers.docx
@@ -1215,4364 +1215,8 @@
           <w:szCs w:val="24"/>
           <w:rtl w:val="0"/>
         </w:rPr>
-        <w:t xml:space="preserve">4. Comparing the variances</w:t>
-      </w:r>
-    </w:p>
-    <w:p>
-      <w:pPr>
-        <w:rPr>
-          <w:rFonts w:ascii="Times New Roman" w:cs="Times New Roman" w:eastAsia="Times New Roman" w:hAnsi="Times New Roman"/>
-          <w:sz w:val="24"/>
-          <w:szCs w:val="24"/>
-        </w:rPr>
-      </w:pPr>
-      <w:r>
-        <w:rPr>
-          <w:rFonts w:ascii="Times New Roman" w:cs="Times New Roman" w:eastAsia="Times New Roman" w:hAnsi="Times New Roman"/>
-          <w:sz w:val="24"/>
-          <w:szCs w:val="24"/>
-          <w:rtl w:val="0"/>
-        </w:rPr>
-        <w:t xml:space="preserve">Because Cov(X,Y) = 6 is positive, the covariance term raises Var(C) and lowers Var(D).</w:t>
-      </w:r>
-    </w:p>
-    <w:p>
-      <w:pPr>
-        <w:rPr>
-          <w:rFonts w:ascii="Times New Roman" w:cs="Times New Roman" w:eastAsia="Times New Roman" w:hAnsi="Times New Roman"/>
-          <w:sz w:val="24"/>
-          <w:szCs w:val="24"/>
-        </w:rPr>
-      </w:pPr>
-      <w:r>
-        <w:rPr>
-          <w:rFonts w:ascii="Times New Roman" w:cs="Times New Roman" w:eastAsia="Times New Roman" w:hAnsi="Times New Roman"/>
-          <w:sz w:val="24"/>
-          <w:szCs w:val="24"/>
-          <w:rtl w:val="0"/>
-        </w:rPr>
-        <w:t xml:space="preserve">Var(C): 193 vs 169, so it is 24 minutes^2 larger with the covariance. For C, a and b are both positive, so 2abCov(X,Y) = +24 gets added. Travel time and delay tend to move together, so adding them makes C more spread out.</w:t>
-      </w:r>
-    </w:p>
-    <w:p>
-      <w:pPr>
-        <w:rPr>
-          <w:rFonts w:ascii="Times New Roman" w:cs="Times New Roman" w:eastAsia="Times New Roman" w:hAnsi="Times New Roman"/>
-          <w:sz w:val="24"/>
-          <w:szCs w:val="24"/>
-        </w:rPr>
-      </w:pPr>
-      <w:r>
-        <w:rPr>
-          <w:rFonts w:ascii="Times New Roman" w:cs="Times New Roman" w:eastAsia="Times New Roman" w:hAnsi="Times New Roman"/>
-          <w:sz w:val="24"/>
-          <w:szCs w:val="24"/>
-          <w:rtl w:val="0"/>
-        </w:rPr>
-        <w:t xml:space="preserve">Var(D): 49 vs 61, so it is 12 minutes^2 smaller with the covariance. For D, a and b have opposite signs, so 2abCov(X,Y) = -12 gets subtracted. When X is high, Y also tends to be high, so taking the difference cancels out some of the variation.</w:t>
-      </w:r>
-    </w:p>
-    <w:p>
-      <w:pPr>
-        <w:rPr>
-          <w:rFonts w:ascii="Times New Roman" w:cs="Times New Roman" w:eastAsia="Times New Roman" w:hAnsi="Times New Roman"/>
-          <w:sz w:val="24"/>
-          <w:szCs w:val="24"/>
-        </w:rPr>
-      </w:pPr>
-    </w:p>
-    <w:p>
-      <w:r>
-        <w:br w:type="page"/>
-      </w:r>
-    </w:p>
-    <w:p>
-      <w:pPr>
-        <w:rPr>
-          <w:rFonts w:ascii="Times New Roman" w:cs="Times New Roman" w:eastAsia="Times New Roman" w:hAnsi="Times New Roman"/>
-          <w:sz w:val="24"/>
-          <w:szCs w:val="24"/>
-        </w:rPr>
-      </w:pPr>
-      <w:r>
-        <w:rPr>
-          <w:rFonts w:ascii="Times New Roman" w:cs="Times New Roman" w:eastAsia="Times New Roman" w:hAnsi="Times New Roman"/>
-          <w:sz w:val="24"/>
-          <w:szCs w:val="24"/>
-          <w:rtl w:val="0"/>
-        </w:rPr>
-        <w:t xml:space="preserve">Question 2</w:t>
-      </w:r>
-    </w:p>
-    <w:p>
-      <w:pPr>
-        <w:rPr>
-          <w:rFonts w:ascii="Times New Roman" w:cs="Times New Roman" w:eastAsia="Times New Roman" w:hAnsi="Times New Roman"/>
-          <w:sz w:val="24"/>
-          <w:szCs w:val="24"/>
-        </w:rPr>
-      </w:pPr>
-      <w:r>
-        <w:rPr>
-          <w:rFonts w:ascii="Times New Roman" w:cs="Times New Roman" w:eastAsia="Times New Roman" w:hAnsi="Times New Roman"/>
-          <w:sz w:val="24"/>
-          <w:szCs w:val="24"/>
-          <w:rtl w:val="0"/>
-        </w:rPr>
-        <w:t xml:space="preserve">Question 2: A Discrete Probability Distribution</w:t>
-      </w:r>
-    </w:p>
-    <w:p>
-      <w:pPr>
-        <w:rPr>
-          <w:rFonts w:ascii="Times New Roman" w:cs="Times New Roman" w:eastAsia="Times New Roman" w:hAnsi="Times New Roman"/>
-          <w:sz w:val="24"/>
-          <w:szCs w:val="24"/>
-        </w:rPr>
-      </w:pPr>
-    </w:p>
-    <w:p>
-      <w:pPr>
-        <w:rPr>
-          <w:rFonts w:ascii="Times New Roman" w:cs="Times New Roman" w:eastAsia="Times New Roman" w:hAnsi="Times New Roman"/>
-          <w:sz w:val="24"/>
-          <w:szCs w:val="24"/>
-        </w:rPr>
-      </w:pPr>
-      <w:r>
-        <w:rPr>
-          <w:rFonts w:ascii="Times New Roman" w:cs="Times New Roman" w:eastAsia="Times New Roman" w:hAnsi="Times New Roman"/>
-          <w:sz w:val="24"/>
-          <w:szCs w:val="24"/>
-          <w:rtl w:val="0"/>
-        </w:rPr>
-        <w:t xml:space="preserve">1. Checking the PMF and building the CDF</w:t>
-      </w:r>
-    </w:p>
-    <w:p>
-      <w:pPr>
-        <w:rPr>
-          <w:rFonts w:ascii="Times New Roman" w:cs="Times New Roman" w:eastAsia="Times New Roman" w:hAnsi="Times New Roman"/>
-          <w:sz w:val="24"/>
-          <w:szCs w:val="24"/>
-        </w:rPr>
-      </w:pPr>
-      <w:r>
-        <w:rPr>
-          <w:rFonts w:ascii="Times New Roman" w:cs="Times New Roman" w:eastAsia="Times New Roman" w:hAnsi="Times New Roman"/>
-          <w:sz w:val="24"/>
-          <w:szCs w:val="24"/>
-          <w:rtl w:val="0"/>
-        </w:rPr>
-        <w:t xml:space="preserve">Every p(j) is between 0 and 1, and</w:t>
-      </w:r>
-    </w:p>
-    <w:p>
-      <w:pPr>
-        <w:rPr>
-          <w:rFonts w:ascii="Times New Roman" w:cs="Times New Roman" w:eastAsia="Times New Roman" w:hAnsi="Times New Roman"/>
-          <w:sz w:val="24"/>
-          <w:szCs w:val="24"/>
-        </w:rPr>
-      </w:pPr>
-      <w:r>
-        <w:rPr>
-          <w:rFonts w:ascii="Times New Roman" w:cs="Times New Roman" w:eastAsia="Times New Roman" w:hAnsi="Times New Roman"/>
-          <w:sz w:val="24"/>
-          <w:szCs w:val="24"/>
-          <w:rtl w:val="0"/>
-        </w:rPr>
-        <w:t xml:space="preserve">0.10 + 0.25 + 0.35 + 0.20 + 0.10 = 1.00</w:t>
-      </w:r>
-    </w:p>
-    <w:p>
-      <w:pPr>
-        <w:rPr>
-          <w:rFonts w:ascii="Times New Roman" w:cs="Times New Roman" w:eastAsia="Times New Roman" w:hAnsi="Times New Roman"/>
-          <w:sz w:val="24"/>
-          <w:szCs w:val="24"/>
-        </w:rPr>
-      </w:pPr>
-      <w:r>
-        <w:rPr>
-          <w:rFonts w:ascii="Times New Roman" w:cs="Times New Roman" w:eastAsia="Times New Roman" w:hAnsi="Times New Roman"/>
-          <w:sz w:val="24"/>
-          <w:szCs w:val="24"/>
-          <w:rtl w:val="0"/>
-        </w:rPr>
-        <w:t xml:space="preserve">so this is a valid PMF.</w:t>
-      </w:r>
-    </w:p>
-    <w:p>
-      <w:pPr>
-        <w:rPr>
-          <w:rFonts w:ascii="Times New Roman" w:cs="Times New Roman" w:eastAsia="Times New Roman" w:hAnsi="Times New Roman"/>
-          <w:sz w:val="24"/>
-          <w:szCs w:val="24"/>
-        </w:rPr>
-      </w:pPr>
-    </w:p>
-    <w:tbl>
-      <w:tblPr>
-        <w:tblW w:w="9360" w:type="dxa"/>
-        <w:tblBorders>
-          <w:top w:val="single" w:sz="4" w:space="0" w:color="000000"/>
-          <w:left w:val="single" w:sz="4" w:space="0" w:color="000000"/>
-          <w:bottom w:val="single" w:sz="4" w:space="0" w:color="000000"/>
-          <w:right w:val="single" w:sz="4" w:space="0" w:color="000000"/>
-          <w:insideH w:val="single" w:sz="4" w:space="0" w:color="000000"/>
-          <w:insideV w:val="single" w:sz="4" w:space="0" w:color="000000"/>
-        </w:tblBorders>
-        <w:tblLayout w:type="fixed"/>
-        <w:tblCellMar>
-          <w:left w:w="100" w:type="dxa"/>
-          <w:right w:w="100" w:type="dxa"/>
-        </w:tblCellMar>
-      </w:tblPr>
-      <w:tblGrid>
-        <w:gridCol w:w="1560"/>
-        <w:gridCol w:w="1560"/>
-        <w:gridCol w:w="1560"/>
-        <w:gridCol w:w="1560"/>
-        <w:gridCol w:w="1560"/>
-        <w:gridCol w:w="1560"/>
-      </w:tblGrid>
-      <w:tr>
-        <w:tc>
-          <w:tcPr>
-            <w:tcW w:w="1560" w:type="dxa"/>
-            <w:shd w:val="clear" w:color="auto" w:fill="E7E6E6"/>
-          </w:tcPr>
-          <w:p>
-            <w:pPr>
-              <w:rPr>
-                <w:rFonts w:ascii="Times New Roman" w:cs="Times New Roman" w:eastAsia="Times New Roman" w:hAnsi="Times New Roman"/>
-                <w:sz w:val="24"/>
-                <w:szCs w:val="24"/>
-              </w:rPr>
-            </w:pPr>
-            <w:r>
-              <w:rPr>
-                <w:rFonts w:ascii="Times New Roman" w:cs="Times New Roman" w:eastAsia="Times New Roman" w:hAnsi="Times New Roman"/>
-                <w:b/>
-                <w:bCs/>
-                <w:sz w:val="24"/>
-                <w:szCs w:val="24"/>
-                <w:rtl w:val="0"/>
-              </w:rPr>
-              <w:t xml:space="preserve">j</w:t>
-            </w:r>
-          </w:p>
-        </w:tc>
-        <w:tc>
-          <w:tcPr>
-            <w:tcW w:w="1560" w:type="dxa"/>
-            <w:shd w:val="clear" w:color="auto" w:fill="E7E6E6"/>
-          </w:tcPr>
-          <w:p>
-            <w:pPr>
-              <w:rPr>
-                <w:rFonts w:ascii="Times New Roman" w:cs="Times New Roman" w:eastAsia="Times New Roman" w:hAnsi="Times New Roman"/>
-                <w:sz w:val="24"/>
-                <w:szCs w:val="24"/>
-              </w:rPr>
-            </w:pPr>
-            <w:r>
-              <w:rPr>
-                <w:rFonts w:ascii="Times New Roman" w:cs="Times New Roman" w:eastAsia="Times New Roman" w:hAnsi="Times New Roman"/>
-                <w:b/>
-                <w:bCs/>
-                <w:sz w:val="24"/>
-                <w:szCs w:val="24"/>
-                <w:rtl w:val="0"/>
-              </w:rPr>
-              <w:t xml:space="preserve">0</w:t>
-            </w:r>
-          </w:p>
-        </w:tc>
-        <w:tc>
-          <w:tcPr>
-            <w:tcW w:w="1560" w:type="dxa"/>
-            <w:shd w:val="clear" w:color="auto" w:fill="E7E6E6"/>
-          </w:tcPr>
-          <w:p>
-            <w:pPr>
-              <w:rPr>
-                <w:rFonts w:ascii="Times New Roman" w:cs="Times New Roman" w:eastAsia="Times New Roman" w:hAnsi="Times New Roman"/>
-                <w:sz w:val="24"/>
-                <w:szCs w:val="24"/>
-              </w:rPr>
-            </w:pPr>
-            <w:r>
-              <w:rPr>
-                <w:rFonts w:ascii="Times New Roman" w:cs="Times New Roman" w:eastAsia="Times New Roman" w:hAnsi="Times New Roman"/>
-                <w:b/>
-                <w:bCs/>
-                <w:sz w:val="24"/>
-                <w:szCs w:val="24"/>
-                <w:rtl w:val="0"/>
-              </w:rPr>
-              <w:t xml:space="preserve">1</w:t>
-            </w:r>
-          </w:p>
-        </w:tc>
-        <w:tc>
-          <w:tcPr>
-            <w:tcW w:w="1560" w:type="dxa"/>
-            <w:shd w:val="clear" w:color="auto" w:fill="E7E6E6"/>
-          </w:tcPr>
-          <w:p>
-            <w:pPr>
-              <w:rPr>
-                <w:rFonts w:ascii="Times New Roman" w:cs="Times New Roman" w:eastAsia="Times New Roman" w:hAnsi="Times New Roman"/>
-                <w:sz w:val="24"/>
-                <w:szCs w:val="24"/>
-              </w:rPr>
-            </w:pPr>
-            <w:r>
-              <w:rPr>
-                <w:rFonts w:ascii="Times New Roman" w:cs="Times New Roman" w:eastAsia="Times New Roman" w:hAnsi="Times New Roman"/>
-                <w:b/>
-                <w:bCs/>
-                <w:sz w:val="24"/>
-                <w:szCs w:val="24"/>
-                <w:rtl w:val="0"/>
-              </w:rPr>
-              <w:t xml:space="preserve">2</w:t>
-            </w:r>
-          </w:p>
-        </w:tc>
-        <w:tc>
-          <w:tcPr>
-            <w:tcW w:w="1560" w:type="dxa"/>
-            <w:shd w:val="clear" w:color="auto" w:fill="E7E6E6"/>
-          </w:tcPr>
-          <w:p>
-            <w:pPr>
-              <w:rPr>
-                <w:rFonts w:ascii="Times New Roman" w:cs="Times New Roman" w:eastAsia="Times New Roman" w:hAnsi="Times New Roman"/>
-                <w:sz w:val="24"/>
-                <w:szCs w:val="24"/>
-              </w:rPr>
-            </w:pPr>
-            <w:r>
-              <w:rPr>
-                <w:rFonts w:ascii="Times New Roman" w:cs="Times New Roman" w:eastAsia="Times New Roman" w:hAnsi="Times New Roman"/>
-                <w:b/>
-                <w:bCs/>
-                <w:sz w:val="24"/>
-                <w:szCs w:val="24"/>
-                <w:rtl w:val="0"/>
-              </w:rPr>
-              <w:t xml:space="preserve">3</w:t>
-            </w:r>
-          </w:p>
-        </w:tc>
-        <w:tc>
-          <w:tcPr>
-            <w:tcW w:w="1560" w:type="dxa"/>
-            <w:shd w:val="clear" w:color="auto" w:fill="E7E6E6"/>
-          </w:tcPr>
-          <w:p>
-            <w:pPr>
-              <w:rPr>
-                <w:rFonts w:ascii="Times New Roman" w:cs="Times New Roman" w:eastAsia="Times New Roman" w:hAnsi="Times New Roman"/>
-                <w:sz w:val="24"/>
-                <w:szCs w:val="24"/>
-              </w:rPr>
-            </w:pPr>
-            <w:r>
-              <w:rPr>
-                <w:rFonts w:ascii="Times New Roman" w:cs="Times New Roman" w:eastAsia="Times New Roman" w:hAnsi="Times New Roman"/>
-                <w:b/>
-                <w:bCs/>
-                <w:sz w:val="24"/>
-                <w:szCs w:val="24"/>
-                <w:rtl w:val="0"/>
-              </w:rPr>
-              <w:t xml:space="preserve">4</w:t>
-            </w:r>
-          </w:p>
-        </w:tc>
-      </w:tr>
-      <w:tr>
-        <w:tc>
-          <w:tcPr>
-            <w:tcW w:w="1560" w:type="dxa"/>
-          </w:tcPr>
-          <w:p>
-            <w:pPr>
-              <w:rPr>
-                <w:rFonts w:ascii="Times New Roman" w:cs="Times New Roman" w:eastAsia="Times New Roman" w:hAnsi="Times New Roman"/>
-                <w:sz w:val="24"/>
-                <w:szCs w:val="24"/>
-              </w:rPr>
-            </w:pPr>
-            <w:r>
-              <w:rPr>
-                <w:rFonts w:ascii="Times New Roman" w:cs="Times New Roman" w:eastAsia="Times New Roman" w:hAnsi="Times New Roman"/>
-                <w:sz w:val="24"/>
-                <w:szCs w:val="24"/>
-                <w:rtl w:val="0"/>
-              </w:rPr>
-              <w:t xml:space="preserve">p(j)</w:t>
-            </w:r>
-          </w:p>
-        </w:tc>
-        <w:tc>
-          <w:tcPr>
-            <w:tcW w:w="1560" w:type="dxa"/>
-          </w:tcPr>
-          <w:p>
-            <w:pPr>
-              <w:rPr>
-                <w:rFonts w:ascii="Times New Roman" w:cs="Times New Roman" w:eastAsia="Times New Roman" w:hAnsi="Times New Roman"/>
-                <w:sz w:val="24"/>
-                <w:szCs w:val="24"/>
-              </w:rPr>
-            </w:pPr>
-            <w:r>
-              <w:rPr>
-                <w:rFonts w:ascii="Times New Roman" w:cs="Times New Roman" w:eastAsia="Times New Roman" w:hAnsi="Times New Roman"/>
-                <w:sz w:val="24"/>
-                <w:szCs w:val="24"/>
-                <w:rtl w:val="0"/>
-              </w:rPr>
-              <w:t xml:space="preserve">0.10</w:t>
-            </w:r>
-          </w:p>
-        </w:tc>
-        <w:tc>
-          <w:tcPr>
-            <w:tcW w:w="1560" w:type="dxa"/>
-          </w:tcPr>
-          <w:p>
-            <w:pPr>
-              <w:rPr>
-                <w:rFonts w:ascii="Times New Roman" w:cs="Times New Roman" w:eastAsia="Times New Roman" w:hAnsi="Times New Roman"/>
-                <w:sz w:val="24"/>
-                <w:szCs w:val="24"/>
-              </w:rPr>
-            </w:pPr>
-            <w:r>
-              <w:rPr>
-                <w:rFonts w:ascii="Times New Roman" w:cs="Times New Roman" w:eastAsia="Times New Roman" w:hAnsi="Times New Roman"/>
-                <w:sz w:val="24"/>
-                <w:szCs w:val="24"/>
-                <w:rtl w:val="0"/>
-              </w:rPr>
-              <w:t xml:space="preserve">0.25</w:t>
-            </w:r>
-          </w:p>
-        </w:tc>
-        <w:tc>
-          <w:tcPr>
-            <w:tcW w:w="1560" w:type="dxa"/>
-          </w:tcPr>
-          <w:p>
-            <w:pPr>
-              <w:rPr>
-                <w:rFonts w:ascii="Times New Roman" w:cs="Times New Roman" w:eastAsia="Times New Roman" w:hAnsi="Times New Roman"/>
-                <w:sz w:val="24"/>
-                <w:szCs w:val="24"/>
-              </w:rPr>
-            </w:pPr>
-            <w:r>
-              <w:rPr>
-                <w:rFonts w:ascii="Times New Roman" w:cs="Times New Roman" w:eastAsia="Times New Roman" w:hAnsi="Times New Roman"/>
-                <w:sz w:val="24"/>
-                <w:szCs w:val="24"/>
-                <w:rtl w:val="0"/>
-              </w:rPr>
-              <w:t xml:space="preserve">0.35</w:t>
-            </w:r>
-          </w:p>
-        </w:tc>
-        <w:tc>
-          <w:tcPr>
-            <w:tcW w:w="1560" w:type="dxa"/>
-          </w:tcPr>
-          <w:p>
-            <w:pPr>
-              <w:rPr>
-                <w:rFonts w:ascii="Times New Roman" w:cs="Times New Roman" w:eastAsia="Times New Roman" w:hAnsi="Times New Roman"/>
-                <w:sz w:val="24"/>
-                <w:szCs w:val="24"/>
-              </w:rPr>
-            </w:pPr>
-            <w:r>
-              <w:rPr>
-                <w:rFonts w:ascii="Times New Roman" w:cs="Times New Roman" w:eastAsia="Times New Roman" w:hAnsi="Times New Roman"/>
-                <w:sz w:val="24"/>
-                <w:szCs w:val="24"/>
-                <w:rtl w:val="0"/>
-              </w:rPr>
-              <w:t xml:space="preserve">0.20</w:t>
-            </w:r>
-          </w:p>
-        </w:tc>
-        <w:tc>
-          <w:tcPr>
-            <w:tcW w:w="1560" w:type="dxa"/>
-          </w:tcPr>
-          <w:p>
-            <w:pPr>
-              <w:rPr>
-                <w:rFonts w:ascii="Times New Roman" w:cs="Times New Roman" w:eastAsia="Times New Roman" w:hAnsi="Times New Roman"/>
-                <w:sz w:val="24"/>
-                <w:szCs w:val="24"/>
-              </w:rPr>
-            </w:pPr>
-            <w:r>
-              <w:rPr>
-                <w:rFonts w:ascii="Times New Roman" w:cs="Times New Roman" w:eastAsia="Times New Roman" w:hAnsi="Times New Roman"/>
-                <w:sz w:val="24"/>
-                <w:szCs w:val="24"/>
-                <w:rtl w:val="0"/>
-              </w:rPr>
-              <w:t xml:space="preserve">0.10</w:t>
-            </w:r>
-          </w:p>
-        </w:tc>
-      </w:tr>
-      <w:tr>
-        <w:tc>
-          <w:tcPr>
-            <w:tcW w:w="1560" w:type="dxa"/>
-          </w:tcPr>
-          <w:p>
-            <w:pPr>
-              <w:rPr>
-                <w:rFonts w:ascii="Times New Roman" w:cs="Times New Roman" w:eastAsia="Times New Roman" w:hAnsi="Times New Roman"/>
-                <w:sz w:val="24"/>
-                <w:szCs w:val="24"/>
-              </w:rPr>
-            </w:pPr>
-            <w:r>
-              <w:rPr>
-                <w:rFonts w:ascii="Times New Roman" w:cs="Times New Roman" w:eastAsia="Times New Roman" w:hAnsi="Times New Roman"/>
-                <w:sz w:val="24"/>
-                <w:szCs w:val="24"/>
-                <w:rtl w:val="0"/>
-              </w:rPr>
-              <w:t xml:space="preserve">F(j) = P(J ≤ j)</w:t>
-            </w:r>
-          </w:p>
-        </w:tc>
-        <w:tc>
-          <w:tcPr>
-            <w:tcW w:w="1560" w:type="dxa"/>
-          </w:tcPr>
-          <w:p>
-            <w:pPr>
-              <w:rPr>
-                <w:rFonts w:ascii="Times New Roman" w:cs="Times New Roman" w:eastAsia="Times New Roman" w:hAnsi="Times New Roman"/>
-                <w:sz w:val="24"/>
-                <w:szCs w:val="24"/>
-              </w:rPr>
-            </w:pPr>
-            <w:r>
-              <w:rPr>
-                <w:rFonts w:ascii="Times New Roman" w:cs="Times New Roman" w:eastAsia="Times New Roman" w:hAnsi="Times New Roman"/>
-                <w:sz w:val="24"/>
-                <w:szCs w:val="24"/>
-                <w:rtl w:val="0"/>
-              </w:rPr>
-              <w:t xml:space="preserve">0.10</w:t>
-            </w:r>
-          </w:p>
-        </w:tc>
-        <w:tc>
-          <w:tcPr>
-            <w:tcW w:w="1560" w:type="dxa"/>
-          </w:tcPr>
-          <w:p>
-            <w:pPr>
-              <w:rPr>
-                <w:rFonts w:ascii="Times New Roman" w:cs="Times New Roman" w:eastAsia="Times New Roman" w:hAnsi="Times New Roman"/>
-                <w:sz w:val="24"/>
-                <w:szCs w:val="24"/>
-              </w:rPr>
-            </w:pPr>
-            <w:r>
-              <w:rPr>
-                <w:rFonts w:ascii="Times New Roman" w:cs="Times New Roman" w:eastAsia="Times New Roman" w:hAnsi="Times New Roman"/>
-                <w:sz w:val="24"/>
-                <w:szCs w:val="24"/>
-                <w:rtl w:val="0"/>
-              </w:rPr>
-              <w:t xml:space="preserve">0.35</w:t>
-            </w:r>
-          </w:p>
-        </w:tc>
-        <w:tc>
-          <w:tcPr>
-            <w:tcW w:w="1560" w:type="dxa"/>
-          </w:tcPr>
-          <w:p>
-            <w:pPr>
-              <w:rPr>
-                <w:rFonts w:ascii="Times New Roman" w:cs="Times New Roman" w:eastAsia="Times New Roman" w:hAnsi="Times New Roman"/>
-                <w:sz w:val="24"/>
-                <w:szCs w:val="24"/>
-              </w:rPr>
-            </w:pPr>
-            <w:r>
-              <w:rPr>
-                <w:rFonts w:ascii="Times New Roman" w:cs="Times New Roman" w:eastAsia="Times New Roman" w:hAnsi="Times New Roman"/>
-                <w:sz w:val="24"/>
-                <w:szCs w:val="24"/>
-                <w:rtl w:val="0"/>
-              </w:rPr>
-              <w:t xml:space="preserve">0.70</w:t>
-            </w:r>
-          </w:p>
-        </w:tc>
-        <w:tc>
-          <w:tcPr>
-            <w:tcW w:w="1560" w:type="dxa"/>
-          </w:tcPr>
-          <w:p>
-            <w:pPr>
-              <w:rPr>
-                <w:rFonts w:ascii="Times New Roman" w:cs="Times New Roman" w:eastAsia="Times New Roman" w:hAnsi="Times New Roman"/>
-                <w:sz w:val="24"/>
-                <w:szCs w:val="24"/>
-              </w:rPr>
-            </w:pPr>
-            <w:r>
-              <w:rPr>
-                <w:rFonts w:ascii="Times New Roman" w:cs="Times New Roman" w:eastAsia="Times New Roman" w:hAnsi="Times New Roman"/>
-                <w:sz w:val="24"/>
-                <w:szCs w:val="24"/>
-                <w:rtl w:val="0"/>
-              </w:rPr>
-              <w:t xml:space="preserve">0.90</w:t>
-            </w:r>
-          </w:p>
-        </w:tc>
-        <w:tc>
-          <w:tcPr>
-            <w:tcW w:w="1560" w:type="dxa"/>
-          </w:tcPr>
-          <w:p>
-            <w:pPr>
-              <w:rPr>
-                <w:rFonts w:ascii="Times New Roman" w:cs="Times New Roman" w:eastAsia="Times New Roman" w:hAnsi="Times New Roman"/>
-                <w:sz w:val="24"/>
-                <w:szCs w:val="24"/>
-              </w:rPr>
-            </w:pPr>
-            <w:r>
-              <w:rPr>
-                <w:rFonts w:ascii="Times New Roman" w:cs="Times New Roman" w:eastAsia="Times New Roman" w:hAnsi="Times New Roman"/>
-                <w:sz w:val="24"/>
-                <w:szCs w:val="24"/>
-                <w:rtl w:val="0"/>
-              </w:rPr>
-              <w:t xml:space="preserve">1.00</w:t>
-            </w:r>
-          </w:p>
-        </w:tc>
-      </w:tr>
-    </w:tbl>
-    <w:p>
-      <w:pPr>
-        <w:rPr>
-          <w:rFonts w:ascii="Times New Roman" w:cs="Times New Roman" w:eastAsia="Times New Roman" w:hAnsi="Times New Roman"/>
-          <w:sz w:val="24"/>
-          <w:szCs w:val="24"/>
-        </w:rPr>
-      </w:pPr>
-    </w:p>
-    <w:p>
-      <w:pPr>
-        <w:rPr>
-          <w:rFonts w:ascii="Times New Roman" w:cs="Times New Roman" w:eastAsia="Times New Roman" w:hAnsi="Times New Roman"/>
-          <w:sz w:val="24"/>
-          <w:szCs w:val="24"/>
-        </w:rPr>
-      </w:pPr>
-      <w:r>
-        <w:rPr>
-          <w:rFonts w:ascii="Times New Roman" w:cs="Times New Roman" w:eastAsia="Times New Roman" w:hAnsi="Times New Roman"/>
-          <w:sz w:val="24"/>
-          <w:szCs w:val="24"/>
-          <w:rtl w:val="0"/>
-        </w:rPr>
-        <w:t xml:space="preserve">The CDF is a step function. It is flat between the possible values of J, since J can't be something like 1.5, so F(1.5) = F(1) = 0.35. It jumps up by p(j) at each whole number j. F(j) = 0 for j &lt; 0 and F(j) = 1 for j ≥ 4.</w:t>
-      </w:r>
-    </w:p>
-    <w:p>
-      <w:pPr>
-        <w:rPr>
-          <w:rFonts w:ascii="Times New Roman" w:cs="Times New Roman" w:eastAsia="Times New Roman" w:hAnsi="Times New Roman"/>
-          <w:sz w:val="24"/>
-          <w:szCs w:val="24"/>
-        </w:rPr>
-      </w:pPr>
-    </w:p>
-    <w:p>
-      <w:pPr>
-        <w:rPr>
-          <w:rFonts w:ascii="Times New Roman" w:cs="Times New Roman" w:eastAsia="Times New Roman" w:hAnsi="Times New Roman"/>
-          <w:sz w:val="24"/>
-          <w:szCs w:val="24"/>
-        </w:rPr>
-      </w:pPr>
-      <w:r>
-        <w:rPr>
-          <w:rFonts w:ascii="Times New Roman" w:cs="Times New Roman" w:eastAsia="Times New Roman" w:hAnsi="Times New Roman"/>
-          <w:sz w:val="24"/>
-          <w:szCs w:val="24"/>
-          <w:rtl w:val="0"/>
-        </w:rPr>
-        <w:t xml:space="preserve">2. Probabilities</w:t>
-      </w:r>
-    </w:p>
-    <w:p>
-      <w:pPr>
-        <w:rPr>
-          <w:rFonts w:ascii="Times New Roman" w:cs="Times New Roman" w:eastAsia="Times New Roman" w:hAnsi="Times New Roman"/>
-          <w:sz w:val="24"/>
-          <w:szCs w:val="24"/>
-        </w:rPr>
-      </w:pPr>
-      <w:r>
-        <w:rPr>
-          <w:rFonts w:ascii="Times New Roman" w:cs="Times New Roman" w:eastAsia="Times New Roman" w:hAnsi="Times New Roman"/>
-          <w:sz w:val="24"/>
-          <w:szCs w:val="24"/>
-          <w:rtl w:val="0"/>
-        </w:rPr>
-        <w:t xml:space="preserve">P(J ≤ 2) = F(2)</w:t>
-      </w:r>
-    </w:p>
-    <w:p>
-      <w:pPr>
-        <w:rPr>
-          <w:rFonts w:ascii="Times New Roman" w:cs="Times New Roman" w:eastAsia="Times New Roman" w:hAnsi="Times New Roman"/>
-          <w:sz w:val="24"/>
-          <w:szCs w:val="24"/>
-        </w:rPr>
-      </w:pPr>
-      <w:r>
-        <w:rPr>
-          <w:rFonts w:ascii="Times New Roman" w:cs="Times New Roman" w:eastAsia="Times New Roman" w:hAnsi="Times New Roman"/>
-          <w:sz w:val="24"/>
-          <w:szCs w:val="24"/>
-          <w:rtl w:val="0"/>
-        </w:rPr>
-        <w:t xml:space="preserve">= 0.70</w:t>
-      </w:r>
-    </w:p>
-    <w:p>
-      <w:pPr>
-        <w:rPr>
-          <w:rFonts w:ascii="Times New Roman" w:cs="Times New Roman" w:eastAsia="Times New Roman" w:hAnsi="Times New Roman"/>
-          <w:sz w:val="24"/>
-          <w:szCs w:val="24"/>
-        </w:rPr>
-      </w:pPr>
-    </w:p>
-    <w:p>
-      <w:pPr>
-        <w:rPr>
-          <w:rFonts w:ascii="Times New Roman" w:cs="Times New Roman" w:eastAsia="Times New Roman" w:hAnsi="Times New Roman"/>
-          <w:sz w:val="24"/>
-          <w:szCs w:val="24"/>
-        </w:rPr>
-      </w:pPr>
-      <w:r>
-        <w:rPr>
-          <w:rFonts w:ascii="Times New Roman" w:cs="Times New Roman" w:eastAsia="Times New Roman" w:hAnsi="Times New Roman"/>
-          <w:sz w:val="24"/>
-          <w:szCs w:val="24"/>
-          <w:rtl w:val="0"/>
-        </w:rPr>
-        <w:t xml:space="preserve">P(1 &lt; J ≤ 3) = F(3) - F(1)</w:t>
-      </w:r>
-    </w:p>
-    <w:p>
-      <w:pPr>
-        <w:rPr>
-          <w:rFonts w:ascii="Times New Roman" w:cs="Times New Roman" w:eastAsia="Times New Roman" w:hAnsi="Times New Roman"/>
-          <w:sz w:val="24"/>
-          <w:szCs w:val="24"/>
-        </w:rPr>
-      </w:pPr>
-      <w:r>
-        <w:rPr>
-          <w:rFonts w:ascii="Times New Roman" w:cs="Times New Roman" w:eastAsia="Times New Roman" w:hAnsi="Times New Roman"/>
-          <w:sz w:val="24"/>
-          <w:szCs w:val="24"/>
-          <w:rtl w:val="0"/>
-        </w:rPr>
-        <w:t xml:space="preserve">= 0.90 - 0.35</w:t>
-      </w:r>
-    </w:p>
-    <w:p>
-      <w:pPr>
-        <w:rPr>
-          <w:rFonts w:ascii="Times New Roman" w:cs="Times New Roman" w:eastAsia="Times New Roman" w:hAnsi="Times New Roman"/>
-          <w:sz w:val="24"/>
-          <w:szCs w:val="24"/>
-        </w:rPr>
-      </w:pPr>
-      <w:r>
-        <w:rPr>
-          <w:rFonts w:ascii="Times New Roman" w:cs="Times New Roman" w:eastAsia="Times New Roman" w:hAnsi="Times New Roman"/>
-          <w:sz w:val="24"/>
-          <w:szCs w:val="24"/>
-          <w:rtl w:val="0"/>
-        </w:rPr>
-        <w:t xml:space="preserve">= 0.55</w:t>
-      </w:r>
-    </w:p>
-    <w:p>
-      <w:pPr>
-        <w:rPr>
-          <w:rFonts w:ascii="Times New Roman" w:cs="Times New Roman" w:eastAsia="Times New Roman" w:hAnsi="Times New Roman"/>
-          <w:sz w:val="24"/>
-          <w:szCs w:val="24"/>
-        </w:rPr>
-      </w:pPr>
-    </w:p>
-    <w:p>
-      <w:pPr>
-        <w:rPr>
-          <w:rFonts w:ascii="Times New Roman" w:cs="Times New Roman" w:eastAsia="Times New Roman" w:hAnsi="Times New Roman"/>
-          <w:sz w:val="24"/>
-          <w:szCs w:val="24"/>
-        </w:rPr>
-      </w:pPr>
-      <w:r>
-        <w:rPr>
-          <w:rFonts w:ascii="Times New Roman" w:cs="Times New Roman" w:eastAsia="Times New Roman" w:hAnsi="Times New Roman"/>
-          <w:sz w:val="24"/>
-          <w:szCs w:val="24"/>
-          <w:rtl w:val="0"/>
-        </w:rPr>
-        <w:t xml:space="preserve">P(J ≥ 3 | J ≥ 1) = P(J ≥ 3) / P(J ≥ 1)</w:t>
-      </w:r>
-    </w:p>
-    <w:p>
-      <w:pPr>
-        <w:rPr>
-          <w:rFonts w:ascii="Times New Roman" w:cs="Times New Roman" w:eastAsia="Times New Roman" w:hAnsi="Times New Roman"/>
-          <w:sz w:val="24"/>
-          <w:szCs w:val="24"/>
-        </w:rPr>
-      </w:pPr>
-      <w:r>
-        <w:rPr>
-          <w:rFonts w:ascii="Times New Roman" w:cs="Times New Roman" w:eastAsia="Times New Roman" w:hAnsi="Times New Roman"/>
-          <w:sz w:val="24"/>
-          <w:szCs w:val="24"/>
-          <w:rtl w:val="0"/>
-        </w:rPr>
-        <w:t xml:space="preserve">= (0.20 + 0.10) / (1 - 0.10)</w:t>
-      </w:r>
-    </w:p>
-    <w:p>
-      <w:pPr>
-        <w:rPr>
-          <w:rFonts w:ascii="Times New Roman" w:cs="Times New Roman" w:eastAsia="Times New Roman" w:hAnsi="Times New Roman"/>
-          <w:sz w:val="24"/>
-          <w:szCs w:val="24"/>
-        </w:rPr>
-      </w:pPr>
-      <w:r>
-        <w:rPr>
-          <w:rFonts w:ascii="Times New Roman" w:cs="Times New Roman" w:eastAsia="Times New Roman" w:hAnsi="Times New Roman"/>
-          <w:sz w:val="24"/>
-          <w:szCs w:val="24"/>
-          <w:rtl w:val="0"/>
-        </w:rPr>
-        <w:t xml:space="preserve">= 0.30 / 0.90</w:t>
-      </w:r>
-    </w:p>
-    <w:p>
-      <w:pPr>
-        <w:rPr>
-          <w:rFonts w:ascii="Times New Roman" w:cs="Times New Roman" w:eastAsia="Times New Roman" w:hAnsi="Times New Roman"/>
-          <w:sz w:val="24"/>
-          <w:szCs w:val="24"/>
-        </w:rPr>
-      </w:pPr>
-      <w:r>
-        <w:rPr>
-          <w:rFonts w:ascii="Times New Roman" w:cs="Times New Roman" w:eastAsia="Times New Roman" w:hAnsi="Times New Roman"/>
-          <w:sz w:val="24"/>
-          <w:szCs w:val="24"/>
-          <w:rtl w:val="0"/>
-        </w:rPr>
-        <w:t xml:space="preserve">= 0.3333</w:t>
-      </w:r>
-    </w:p>
-    <w:p>
-      <w:pPr>
-        <w:rPr>
-          <w:rFonts w:ascii="Times New Roman" w:cs="Times New Roman" w:eastAsia="Times New Roman" w:hAnsi="Times New Roman"/>
-          <w:sz w:val="24"/>
-          <w:szCs w:val="24"/>
-        </w:rPr>
-      </w:pPr>
-      <w:r>
-        <w:rPr>
-          <w:rFonts w:ascii="Times New Roman" w:cs="Times New Roman" w:eastAsia="Times New Roman" w:hAnsi="Times New Roman"/>
-          <w:sz w:val="24"/>
-          <w:szCs w:val="24"/>
-          <w:rtl w:val="0"/>
-        </w:rPr>
-        <w:t xml:space="preserve">The new reference group is only students who received at least one job offer, not all graduates.</w:t>
-      </w:r>
-    </w:p>
-    <w:p>
-      <w:pPr>
-        <w:rPr>
-          <w:rFonts w:ascii="Times New Roman" w:cs="Times New Roman" w:eastAsia="Times New Roman" w:hAnsi="Times New Roman"/>
-          <w:sz w:val="24"/>
-          <w:szCs w:val="24"/>
-        </w:rPr>
-      </w:pPr>
-    </w:p>
-    <w:p>
-      <w:pPr>
-        <w:rPr>
-          <w:rFonts w:ascii="Times New Roman" w:cs="Times New Roman" w:eastAsia="Times New Roman" w:hAnsi="Times New Roman"/>
-          <w:sz w:val="24"/>
-          <w:szCs w:val="24"/>
-        </w:rPr>
-      </w:pPr>
-      <w:r>
-        <w:rPr>
-          <w:rFonts w:ascii="Times New Roman" w:cs="Times New Roman" w:eastAsia="Times New Roman" w:hAnsi="Times New Roman"/>
-          <w:sz w:val="24"/>
-          <w:szCs w:val="24"/>
-          <w:rtl w:val="0"/>
-        </w:rPr>
-        <w:t xml:space="preserve">3. E(J), Var(J), SD(J)</w:t>
-      </w:r>
-    </w:p>
-    <w:p>
-      <w:pPr>
-        <w:rPr>
-          <w:rFonts w:ascii="Times New Roman" w:cs="Times New Roman" w:eastAsia="Times New Roman" w:hAnsi="Times New Roman"/>
-          <w:sz w:val="24"/>
-          <w:szCs w:val="24"/>
-        </w:rPr>
-      </w:pPr>
-      <w:r>
-        <w:rPr>
-          <w:rFonts w:ascii="Times New Roman" w:cs="Times New Roman" w:eastAsia="Times New Roman" w:hAnsi="Times New Roman"/>
-          <w:sz w:val="24"/>
-          <w:szCs w:val="24"/>
-          <w:rtl w:val="0"/>
-        </w:rPr>
-        <w:t xml:space="preserve">E(J) = 0(0.10) + 1(0.25) + 2(0.35) + 3(0.20) + 4(0.10)</w:t>
-      </w:r>
-    </w:p>
-    <w:p>
-      <w:pPr>
-        <w:rPr>
-          <w:rFonts w:ascii="Times New Roman" w:cs="Times New Roman" w:eastAsia="Times New Roman" w:hAnsi="Times New Roman"/>
-          <w:sz w:val="24"/>
-          <w:szCs w:val="24"/>
-        </w:rPr>
-      </w:pPr>
-      <w:r>
-        <w:rPr>
-          <w:rFonts w:ascii="Times New Roman" w:cs="Times New Roman" w:eastAsia="Times New Roman" w:hAnsi="Times New Roman"/>
-          <w:sz w:val="24"/>
-          <w:szCs w:val="24"/>
-          <w:rtl w:val="0"/>
-        </w:rPr>
-        <w:t xml:space="preserve">= 0 + 0.25 + 0.70 + 0.60 + 0.40</w:t>
-      </w:r>
-    </w:p>
-    <w:p>
-      <w:pPr>
-        <w:rPr>
-          <w:rFonts w:ascii="Times New Roman" w:cs="Times New Roman" w:eastAsia="Times New Roman" w:hAnsi="Times New Roman"/>
-          <w:sz w:val="24"/>
-          <w:szCs w:val="24"/>
-        </w:rPr>
-      </w:pPr>
-      <w:r>
-        <w:rPr>
-          <w:rFonts w:ascii="Times New Roman" w:cs="Times New Roman" w:eastAsia="Times New Roman" w:hAnsi="Times New Roman"/>
-          <w:sz w:val="24"/>
-          <w:szCs w:val="24"/>
-          <w:rtl w:val="0"/>
-        </w:rPr>
-        <w:t xml:space="preserve">= 1.95 offers</w:t>
-      </w:r>
-    </w:p>
-    <w:p>
-      <w:pPr>
-        <w:rPr>
-          <w:rFonts w:ascii="Times New Roman" w:cs="Times New Roman" w:eastAsia="Times New Roman" w:hAnsi="Times New Roman"/>
-          <w:sz w:val="24"/>
-          <w:szCs w:val="24"/>
-        </w:rPr>
-      </w:pPr>
-    </w:p>
-    <w:p>
-      <w:pPr>
-        <w:rPr>
-          <w:rFonts w:ascii="Times New Roman" w:cs="Times New Roman" w:eastAsia="Times New Roman" w:hAnsi="Times New Roman"/>
-          <w:sz w:val="24"/>
-          <w:szCs w:val="24"/>
-        </w:rPr>
-      </w:pPr>
-      <w:r>
-        <w:rPr>
-          <w:rFonts w:ascii="Times New Roman" w:cs="Times New Roman" w:eastAsia="Times New Roman" w:hAnsi="Times New Roman"/>
-          <w:sz w:val="24"/>
-          <w:szCs w:val="24"/>
-          <w:rtl w:val="0"/>
-        </w:rPr>
-        <w:t xml:space="preserve">E(J^2) = 0^2(0.10) + 1^2(0.25) + 2^2(0.35) + 3^2(0.20) + 4^2(0.10)</w:t>
-      </w:r>
-    </w:p>
-    <w:p>
-      <w:pPr>
-        <w:rPr>
-          <w:rFonts w:ascii="Times New Roman" w:cs="Times New Roman" w:eastAsia="Times New Roman" w:hAnsi="Times New Roman"/>
-          <w:sz w:val="24"/>
-          <w:szCs w:val="24"/>
-        </w:rPr>
-      </w:pPr>
-      <w:r>
-        <w:rPr>
-          <w:rFonts w:ascii="Times New Roman" w:cs="Times New Roman" w:eastAsia="Times New Roman" w:hAnsi="Times New Roman"/>
-          <w:sz w:val="24"/>
-          <w:szCs w:val="24"/>
-          <w:rtl w:val="0"/>
-        </w:rPr>
-        <w:t xml:space="preserve">= 0 + 0.25 + 1.40 + 1.80 + 1.60</w:t>
-      </w:r>
-    </w:p>
-    <w:p>
-      <w:pPr>
-        <w:rPr>
-          <w:rFonts w:ascii="Times New Roman" w:cs="Times New Roman" w:eastAsia="Times New Roman" w:hAnsi="Times New Roman"/>
-          <w:sz w:val="24"/>
-          <w:szCs w:val="24"/>
-        </w:rPr>
-      </w:pPr>
-      <w:r>
-        <w:rPr>
-          <w:rFonts w:ascii="Times New Roman" w:cs="Times New Roman" w:eastAsia="Times New Roman" w:hAnsi="Times New Roman"/>
-          <w:sz w:val="24"/>
-          <w:szCs w:val="24"/>
-          <w:rtl w:val="0"/>
-        </w:rPr>
-        <w:t xml:space="preserve">= 5.05</w:t>
-      </w:r>
-    </w:p>
-    <w:p>
-      <w:pPr>
-        <w:rPr>
-          <w:rFonts w:ascii="Times New Roman" w:cs="Times New Roman" w:eastAsia="Times New Roman" w:hAnsi="Times New Roman"/>
-          <w:sz w:val="24"/>
-          <w:szCs w:val="24"/>
-        </w:rPr>
-      </w:pPr>
-    </w:p>
-    <w:p>
-      <w:pPr>
-        <w:rPr>
-          <w:rFonts w:ascii="Times New Roman" w:cs="Times New Roman" w:eastAsia="Times New Roman" w:hAnsi="Times New Roman"/>
-          <w:sz w:val="24"/>
-          <w:szCs w:val="24"/>
-        </w:rPr>
-      </w:pPr>
-      <w:r>
-        <w:rPr>
-          <w:rFonts w:ascii="Times New Roman" w:cs="Times New Roman" w:eastAsia="Times New Roman" w:hAnsi="Times New Roman"/>
-          <w:sz w:val="24"/>
-          <w:szCs w:val="24"/>
-          <w:rtl w:val="0"/>
-        </w:rPr>
-        <w:t xml:space="preserve">Var(J) = E(J^2) - [E(J)]^2</w:t>
-      </w:r>
-    </w:p>
-    <w:p>
-      <w:pPr>
-        <w:rPr>
-          <w:rFonts w:ascii="Times New Roman" w:cs="Times New Roman" w:eastAsia="Times New Roman" w:hAnsi="Times New Roman"/>
-          <w:sz w:val="24"/>
-          <w:szCs w:val="24"/>
-        </w:rPr>
-      </w:pPr>
-      <w:r>
-        <w:rPr>
-          <w:rFonts w:ascii="Times New Roman" w:cs="Times New Roman" w:eastAsia="Times New Roman" w:hAnsi="Times New Roman"/>
-          <w:sz w:val="24"/>
-          <w:szCs w:val="24"/>
-          <w:rtl w:val="0"/>
-        </w:rPr>
-        <w:t xml:space="preserve">= 5.05 - 1.95^2</w:t>
-      </w:r>
-    </w:p>
-    <w:p>
-      <w:pPr>
-        <w:rPr>
-          <w:rFonts w:ascii="Times New Roman" w:cs="Times New Roman" w:eastAsia="Times New Roman" w:hAnsi="Times New Roman"/>
-          <w:sz w:val="24"/>
-          <w:szCs w:val="24"/>
-        </w:rPr>
-      </w:pPr>
-      <w:r>
-        <w:rPr>
-          <w:rFonts w:ascii="Times New Roman" w:cs="Times New Roman" w:eastAsia="Times New Roman" w:hAnsi="Times New Roman"/>
-          <w:sz w:val="24"/>
-          <w:szCs w:val="24"/>
-          <w:rtl w:val="0"/>
-        </w:rPr>
-        <w:t xml:space="preserve">= 5.05 - 3.8025</w:t>
-      </w:r>
-    </w:p>
-    <w:p>
-      <w:pPr>
-        <w:rPr>
-          <w:rFonts w:ascii="Times New Roman" w:cs="Times New Roman" w:eastAsia="Times New Roman" w:hAnsi="Times New Roman"/>
-          <w:sz w:val="24"/>
-          <w:szCs w:val="24"/>
-        </w:rPr>
-      </w:pPr>
-      <w:r>
-        <w:rPr>
-          <w:rFonts w:ascii="Times New Roman" w:cs="Times New Roman" w:eastAsia="Times New Roman" w:hAnsi="Times New Roman"/>
-          <w:sz w:val="24"/>
-          <w:szCs w:val="24"/>
-          <w:rtl w:val="0"/>
-        </w:rPr>
-        <w:t xml:space="preserve">= 1.2475 offers^2</w:t>
-      </w:r>
-    </w:p>
-    <w:p>
-      <w:pPr>
-        <w:rPr>
-          <w:rFonts w:ascii="Times New Roman" w:cs="Times New Roman" w:eastAsia="Times New Roman" w:hAnsi="Times New Roman"/>
-          <w:sz w:val="24"/>
-          <w:szCs w:val="24"/>
-        </w:rPr>
-      </w:pPr>
-    </w:p>
-    <w:p>
-      <w:pPr>
-        <w:rPr>
-          <w:rFonts w:ascii="Times New Roman" w:cs="Times New Roman" w:eastAsia="Times New Roman" w:hAnsi="Times New Roman"/>
-          <w:sz w:val="24"/>
-          <w:szCs w:val="24"/>
-        </w:rPr>
-      </w:pPr>
-      <w:r>
-        <w:rPr>
-          <w:rFonts w:ascii="Times New Roman" w:cs="Times New Roman" w:eastAsia="Times New Roman" w:hAnsi="Times New Roman"/>
-          <w:sz w:val="24"/>
-          <w:szCs w:val="24"/>
-          <w:rtl w:val="0"/>
-        </w:rPr>
-        <w:t xml:space="preserve">SD(J) = sqrt(1.2475)</w:t>
-      </w:r>
-    </w:p>
-    <w:p>
-      <w:pPr>
-        <w:rPr>
-          <w:rFonts w:ascii="Times New Roman" w:cs="Times New Roman" w:eastAsia="Times New Roman" w:hAnsi="Times New Roman"/>
-          <w:sz w:val="24"/>
-          <w:szCs w:val="24"/>
-        </w:rPr>
-      </w:pPr>
-      <w:r>
-        <w:rPr>
-          <w:rFonts w:ascii="Times New Roman" w:cs="Times New Roman" w:eastAsia="Times New Roman" w:hAnsi="Times New Roman"/>
-          <w:sz w:val="24"/>
-          <w:szCs w:val="24"/>
-          <w:rtl w:val="0"/>
-        </w:rPr>
-        <w:t xml:space="preserve">= 1.12 offers</w:t>
-      </w:r>
-    </w:p>
-    <w:p>
-      <w:pPr>
-        <w:rPr>
-          <w:rFonts w:ascii="Times New Roman" w:cs="Times New Roman" w:eastAsia="Times New Roman" w:hAnsi="Times New Roman"/>
-          <w:sz w:val="24"/>
-          <w:szCs w:val="24"/>
-        </w:rPr>
-      </w:pPr>
-    </w:p>
-    <w:p>
-      <w:pPr>
-        <w:rPr>
-          <w:rFonts w:ascii="Times New Roman" w:cs="Times New Roman" w:eastAsia="Times New Roman" w:hAnsi="Times New Roman"/>
-          <w:sz w:val="24"/>
-          <w:szCs w:val="24"/>
-        </w:rPr>
-      </w:pPr>
-      <w:r>
-        <w:rPr>
-          <w:rFonts w:ascii="Times New Roman" w:cs="Times New Roman" w:eastAsia="Times New Roman" w:hAnsi="Times New Roman"/>
-          <w:sz w:val="24"/>
-          <w:szCs w:val="24"/>
-          <w:rtl w:val="0"/>
-        </w:rPr>
-        <w:t xml:space="preserve">4. B = 1000 + 750J</w:t>
-      </w:r>
-    </w:p>
-    <w:p>
-      <w:pPr>
-        <w:rPr>
-          <w:rFonts w:ascii="Times New Roman" w:cs="Times New Roman" w:eastAsia="Times New Roman" w:hAnsi="Times New Roman"/>
-          <w:sz w:val="24"/>
-          <w:szCs w:val="24"/>
-        </w:rPr>
-      </w:pPr>
-      <w:r>
-        <w:rPr>
-          <w:rFonts w:ascii="Times New Roman" w:cs="Times New Roman" w:eastAsia="Times New Roman" w:hAnsi="Times New Roman"/>
-          <w:sz w:val="24"/>
-          <w:szCs w:val="24"/>
-          <w:rtl w:val="0"/>
-        </w:rPr>
-        <w:t xml:space="preserve">E(B) = 1000 + 750E(J)</w:t>
-      </w:r>
-    </w:p>
-    <w:p>
-      <w:pPr>
-        <w:rPr>
-          <w:rFonts w:ascii="Times New Roman" w:cs="Times New Roman" w:eastAsia="Times New Roman" w:hAnsi="Times New Roman"/>
-          <w:sz w:val="24"/>
-          <w:szCs w:val="24"/>
-        </w:rPr>
-      </w:pPr>
-      <w:r>
-        <w:rPr>
-          <w:rFonts w:ascii="Times New Roman" w:cs="Times New Roman" w:eastAsia="Times New Roman" w:hAnsi="Times New Roman"/>
-          <w:sz w:val="24"/>
-          <w:szCs w:val="24"/>
-          <w:rtl w:val="0"/>
-        </w:rPr>
-        <w:t xml:space="preserve">= 1000 + 750(1.95)</w:t>
-      </w:r>
-    </w:p>
-    <w:p>
-      <w:pPr>
-        <w:rPr>
-          <w:rFonts w:ascii="Times New Roman" w:cs="Times New Roman" w:eastAsia="Times New Roman" w:hAnsi="Times New Roman"/>
-          <w:sz w:val="24"/>
-          <w:szCs w:val="24"/>
-        </w:rPr>
-      </w:pPr>
-      <w:r>
-        <w:rPr>
-          <w:rFonts w:ascii="Times New Roman" w:cs="Times New Roman" w:eastAsia="Times New Roman" w:hAnsi="Times New Roman"/>
-          <w:sz w:val="24"/>
-          <w:szCs w:val="24"/>
-          <w:rtl w:val="0"/>
-        </w:rPr>
-        <w:t xml:space="preserve">= $2,462.50</w:t>
-      </w:r>
-    </w:p>
-    <w:p>
-      <w:pPr>
-        <w:rPr>
-          <w:rFonts w:ascii="Times New Roman" w:cs="Times New Roman" w:eastAsia="Times New Roman" w:hAnsi="Times New Roman"/>
-          <w:sz w:val="24"/>
-          <w:szCs w:val="24"/>
-        </w:rPr>
-      </w:pPr>
-    </w:p>
-    <w:p>
-      <w:pPr>
-        <w:rPr>
-          <w:rFonts w:ascii="Times New Roman" w:cs="Times New Roman" w:eastAsia="Times New Roman" w:hAnsi="Times New Roman"/>
-          <w:sz w:val="24"/>
-          <w:szCs w:val="24"/>
-        </w:rPr>
-      </w:pPr>
-      <w:r>
-        <w:rPr>
-          <w:rFonts w:ascii="Times New Roman" w:cs="Times New Roman" w:eastAsia="Times New Roman" w:hAnsi="Times New Roman"/>
-          <w:sz w:val="24"/>
-          <w:szCs w:val="24"/>
-          <w:rtl w:val="0"/>
-        </w:rPr>
-        <w:t xml:space="preserve">Var(B) = 750^2 Var(J)   (adding the constant 1000 doesn't change the spread)</w:t>
-      </w:r>
-    </w:p>
-    <w:p>
-      <w:pPr>
-        <w:rPr>
-          <w:rFonts w:ascii="Times New Roman" w:cs="Times New Roman" w:eastAsia="Times New Roman" w:hAnsi="Times New Roman"/>
-          <w:sz w:val="24"/>
-          <w:szCs w:val="24"/>
-        </w:rPr>
-      </w:pPr>
-      <w:r>
-        <w:rPr>
-          <w:rFonts w:ascii="Times New Roman" w:cs="Times New Roman" w:eastAsia="Times New Roman" w:hAnsi="Times New Roman"/>
-          <w:sz w:val="24"/>
-          <w:szCs w:val="24"/>
-          <w:rtl w:val="0"/>
-        </w:rPr>
-        <w:t xml:space="preserve">= 562,500(1.2475)</w:t>
-      </w:r>
-    </w:p>
-    <w:p>
-      <w:pPr>
-        <w:rPr>
-          <w:rFonts w:ascii="Times New Roman" w:cs="Times New Roman" w:eastAsia="Times New Roman" w:hAnsi="Times New Roman"/>
-          <w:sz w:val="24"/>
-          <w:szCs w:val="24"/>
-        </w:rPr>
-      </w:pPr>
-      <w:r>
-        <w:rPr>
-          <w:rFonts w:ascii="Times New Roman" w:cs="Times New Roman" w:eastAsia="Times New Roman" w:hAnsi="Times New Roman"/>
-          <w:sz w:val="24"/>
-          <w:szCs w:val="24"/>
-          <w:rtl w:val="0"/>
-        </w:rPr>
-        <w:t xml:space="preserve">= 701,718.75 dollars^2</w:t>
-      </w:r>
-    </w:p>
-    <w:p>
-      <w:pPr>
-        <w:rPr>
-          <w:rFonts w:ascii="Times New Roman" w:cs="Times New Roman" w:eastAsia="Times New Roman" w:hAnsi="Times New Roman"/>
-          <w:sz w:val="24"/>
-          <w:szCs w:val="24"/>
-        </w:rPr>
-      </w:pPr>
-    </w:p>
-    <w:p>
-      <w:pPr>
-        <w:rPr>
-          <w:rFonts w:ascii="Times New Roman" w:cs="Times New Roman" w:eastAsia="Times New Roman" w:hAnsi="Times New Roman"/>
-          <w:sz w:val="24"/>
-          <w:szCs w:val="24"/>
-        </w:rPr>
-      </w:pPr>
-      <w:r>
-        <w:rPr>
-          <w:rFonts w:ascii="Times New Roman" w:cs="Times New Roman" w:eastAsia="Times New Roman" w:hAnsi="Times New Roman"/>
-          <w:sz w:val="24"/>
-          <w:szCs w:val="24"/>
-          <w:rtl w:val="0"/>
-        </w:rPr>
-        <w:t xml:space="preserve">SD(B) = 750 SD(J)</w:t>
-      </w:r>
-    </w:p>
-    <w:p>
-      <w:pPr>
-        <w:rPr>
-          <w:rFonts w:ascii="Times New Roman" w:cs="Times New Roman" w:eastAsia="Times New Roman" w:hAnsi="Times New Roman"/>
-          <w:sz w:val="24"/>
-          <w:szCs w:val="24"/>
-        </w:rPr>
-      </w:pPr>
-      <w:r>
-        <w:rPr>
-          <w:rFonts w:ascii="Times New Roman" w:cs="Times New Roman" w:eastAsia="Times New Roman" w:hAnsi="Times New Roman"/>
-          <w:sz w:val="24"/>
-          <w:szCs w:val="24"/>
-          <w:rtl w:val="0"/>
-        </w:rPr>
-        <w:t xml:space="preserve">= 750(1.1169)</w:t>
-      </w:r>
-    </w:p>
-    <w:p>
-      <w:pPr>
-        <w:rPr>
-          <w:rFonts w:ascii="Times New Roman" w:cs="Times New Roman" w:eastAsia="Times New Roman" w:hAnsi="Times New Roman"/>
-          <w:sz w:val="24"/>
-          <w:szCs w:val="24"/>
-        </w:rPr>
-      </w:pPr>
-      <w:r>
-        <w:rPr>
-          <w:rFonts w:ascii="Times New Roman" w:cs="Times New Roman" w:eastAsia="Times New Roman" w:hAnsi="Times New Roman"/>
-          <w:sz w:val="24"/>
-          <w:szCs w:val="24"/>
-          <w:rtl w:val="0"/>
-        </w:rPr>
-        <w:t xml:space="preserve">= $837.69</w:t>
-      </w:r>
-    </w:p>
-    <w:p>
-      <w:pPr>
-        <w:rPr>
-          <w:rFonts w:ascii="Times New Roman" w:cs="Times New Roman" w:eastAsia="Times New Roman" w:hAnsi="Times New Roman"/>
-          <w:sz w:val="24"/>
-          <w:szCs w:val="24"/>
-        </w:rPr>
-      </w:pPr>
-    </w:p>
-    <w:p>
-      <w:pPr>
-        <w:rPr>
-          <w:rFonts w:ascii="Times New Roman" w:cs="Times New Roman" w:eastAsia="Times New Roman" w:hAnsi="Times New Roman"/>
-          <w:sz w:val="24"/>
-          <w:szCs w:val="24"/>
-        </w:rPr>
-      </w:pPr>
-      <w:r>
-        <w:rPr>
-          <w:rFonts w:ascii="Times New Roman" w:cs="Times New Roman" w:eastAsia="Times New Roman" w:hAnsi="Times New Roman"/>
-          <w:sz w:val="24"/>
-          <w:szCs w:val="24"/>
-          <w:rtl w:val="0"/>
-        </w:rPr>
-        <w:t xml:space="preserve">Interpretation: On average, a participating graduate receives about $2,462.50 from the program. A typical graduate's payment is about $837.69 above or below that average, depending on how many job offers they get.</w:t>
-      </w:r>
-    </w:p>
-    <w:p>
-      <w:pPr>
-        <w:rPr>
-          <w:rFonts w:ascii="Times New Roman" w:cs="Times New Roman" w:eastAsia="Times New Roman" w:hAnsi="Times New Roman"/>
-          <w:sz w:val="24"/>
-          <w:szCs w:val="24"/>
-        </w:rPr>
-      </w:pPr>
-    </w:p>
-    <w:p>
-      <w:r>
-        <w:br w:type="page"/>
-      </w:r>
-    </w:p>
-    <w:p>
-      <w:pPr>
-        <w:rPr>
-          <w:rFonts w:ascii="Times New Roman" w:cs="Times New Roman" w:eastAsia="Times New Roman" w:hAnsi="Times New Roman"/>
-          <w:sz w:val="24"/>
-          <w:szCs w:val="24"/>
-        </w:rPr>
-      </w:pPr>
-      <w:r>
-        <w:rPr>
-          <w:rFonts w:ascii="Times New Roman" w:cs="Times New Roman" w:eastAsia="Times New Roman" w:hAnsi="Times New Roman"/>
-          <w:sz w:val="24"/>
-          <w:szCs w:val="24"/>
-          <w:rtl w:val="0"/>
-        </w:rPr>
-        <w:t xml:space="preserve">Question 3</w:t>
-      </w:r>
-    </w:p>
-    <w:p>
-      <w:pPr>
-        <w:rPr>
-          <w:rFonts w:ascii="Times New Roman" w:cs="Times New Roman" w:eastAsia="Times New Roman" w:hAnsi="Times New Roman"/>
-          <w:sz w:val="24"/>
-          <w:szCs w:val="24"/>
-        </w:rPr>
-      </w:pPr>
-      <w:r>
-        <w:rPr>
-          <w:rFonts w:ascii="Times New Roman" w:cs="Times New Roman" w:eastAsia="Times New Roman" w:hAnsi="Times New Roman"/>
-          <w:sz w:val="24"/>
-          <w:szCs w:val="24"/>
-          <w:rtl w:val="0"/>
-        </w:rPr>
-        <w:t xml:space="preserve">Question 3: Sample Statistics by Hand</w:t>
-      </w:r>
-    </w:p>
-    <w:p>
-      <w:pPr>
-        <w:rPr>
-          <w:rFonts w:ascii="Times New Roman" w:cs="Times New Roman" w:eastAsia="Times New Roman" w:hAnsi="Times New Roman"/>
-          <w:sz w:val="24"/>
-          <w:szCs w:val="24"/>
-        </w:rPr>
-      </w:pPr>
-      <w:r>
-        <w:rPr>
-          <w:rFonts w:ascii="Times New Roman" w:cs="Times New Roman" w:eastAsia="Times New Roman" w:hAnsi="Times New Roman"/>
-          <w:sz w:val="24"/>
-          <w:szCs w:val="24"/>
-          <w:rtl w:val="0"/>
-        </w:rPr>
-        <w:t xml:space="preserve">Data (minutes): 17, 19, 20, 21, 22, 23, 24, 24, 24, 25, 26, 27, 28, 30, 45</w:t>
-      </w:r>
-    </w:p>
-    <w:p>
-      <w:pPr>
-        <w:rPr>
-          <w:rFonts w:ascii="Times New Roman" w:cs="Times New Roman" w:eastAsia="Times New Roman" w:hAnsi="Times New Roman"/>
-          <w:sz w:val="24"/>
-          <w:szCs w:val="24"/>
-        </w:rPr>
-      </w:pPr>
-    </w:p>
-    <w:p>
-      <w:pPr>
-        <w:rPr>
-          <w:rFonts w:ascii="Times New Roman" w:cs="Times New Roman" w:eastAsia="Times New Roman" w:hAnsi="Times New Roman"/>
-          <w:sz w:val="24"/>
-          <w:szCs w:val="24"/>
-        </w:rPr>
-      </w:pPr>
-      <w:r>
-        <w:rPr>
-          <w:rFonts w:ascii="Times New Roman" w:cs="Times New Roman" w:eastAsia="Times New Roman" w:hAnsi="Times New Roman"/>
-          <w:sz w:val="24"/>
-          <w:szCs w:val="24"/>
-          <w:rtl w:val="0"/>
-        </w:rPr>
-        <w:t xml:space="preserve">1. Sample size, mean, median, mode</w:t>
-      </w:r>
-    </w:p>
-    <w:p>
-      <w:pPr>
-        <w:rPr>
-          <w:rFonts w:ascii="Times New Roman" w:cs="Times New Roman" w:eastAsia="Times New Roman" w:hAnsi="Times New Roman"/>
-          <w:sz w:val="24"/>
-          <w:szCs w:val="24"/>
-        </w:rPr>
-      </w:pPr>
-      <w:r>
-        <w:rPr>
-          <w:rFonts w:ascii="Times New Roman" w:cs="Times New Roman" w:eastAsia="Times New Roman" w:hAnsi="Times New Roman"/>
-          <w:sz w:val="24"/>
-          <w:szCs w:val="24"/>
-          <w:rtl w:val="0"/>
-        </w:rPr>
-        <w:t xml:space="preserve">n = 15</w:t>
-      </w:r>
-    </w:p>
-    <w:p>
-      <w:pPr>
-        <w:rPr>
-          <w:rFonts w:ascii="Times New Roman" w:cs="Times New Roman" w:eastAsia="Times New Roman" w:hAnsi="Times New Roman"/>
-          <w:sz w:val="24"/>
-          <w:szCs w:val="24"/>
-        </w:rPr>
-      </w:pPr>
-    </w:p>
-    <w:p>
-      <w:pPr>
-        <w:rPr>
-          <w:rFonts w:ascii="Times New Roman" w:cs="Times New Roman" w:eastAsia="Times New Roman" w:hAnsi="Times New Roman"/>
-          <w:sz w:val="24"/>
-          <w:szCs w:val="24"/>
-        </w:rPr>
-      </w:pPr>
-      <w:r>
-        <w:rPr>
-          <w:rFonts w:ascii="Times New Roman" w:cs="Times New Roman" w:eastAsia="Times New Roman" w:hAnsi="Times New Roman"/>
-          <w:sz w:val="24"/>
-          <w:szCs w:val="24"/>
-          <w:rtl w:val="0"/>
-        </w:rPr>
-        <w:t xml:space="preserve">Sum = 17 + 19 + 20 + 21 + 22 + 23 + 24 + 24 + 24 + 25 + 26 + 27 + 28 + 30 + 45 = 375</w:t>
-      </w:r>
-    </w:p>
-    <w:p>
-      <w:pPr>
-        <w:rPr>
-          <w:rFonts w:ascii="Times New Roman" w:cs="Times New Roman" w:eastAsia="Times New Roman" w:hAnsi="Times New Roman"/>
-          <w:sz w:val="24"/>
-          <w:szCs w:val="24"/>
-        </w:rPr>
-      </w:pPr>
-      <w:r>
-        <w:rPr>
-          <w:rFonts w:ascii="Times New Roman" w:cs="Times New Roman" w:eastAsia="Times New Roman" w:hAnsi="Times New Roman"/>
-          <w:sz w:val="24"/>
-          <w:szCs w:val="24"/>
-          <w:rtl w:val="0"/>
-        </w:rPr>
-        <w:t xml:space="preserve">Mean = 375 / 15</w:t>
-      </w:r>
-    </w:p>
-    <w:p>
-      <w:pPr>
-        <w:rPr>
-          <w:rFonts w:ascii="Times New Roman" w:cs="Times New Roman" w:eastAsia="Times New Roman" w:hAnsi="Times New Roman"/>
-          <w:sz w:val="24"/>
-          <w:szCs w:val="24"/>
-        </w:rPr>
-      </w:pPr>
-      <w:r>
-        <w:rPr>
-          <w:rFonts w:ascii="Times New Roman" w:cs="Times New Roman" w:eastAsia="Times New Roman" w:hAnsi="Times New Roman"/>
-          <w:sz w:val="24"/>
-          <w:szCs w:val="24"/>
-          <w:rtl w:val="0"/>
-        </w:rPr>
-        <w:t xml:space="preserve">= 25 minutes</w:t>
-      </w:r>
-    </w:p>
-    <w:p>
-      <w:pPr>
-        <w:rPr>
-          <w:rFonts w:ascii="Times New Roman" w:cs="Times New Roman" w:eastAsia="Times New Roman" w:hAnsi="Times New Roman"/>
-          <w:sz w:val="24"/>
-          <w:szCs w:val="24"/>
-        </w:rPr>
-      </w:pPr>
-    </w:p>
-    <w:p>
-      <w:pPr>
-        <w:rPr>
-          <w:rFonts w:ascii="Times New Roman" w:cs="Times New Roman" w:eastAsia="Times New Roman" w:hAnsi="Times New Roman"/>
-          <w:sz w:val="24"/>
-          <w:szCs w:val="24"/>
-        </w:rPr>
-      </w:pPr>
-      <w:r>
-        <w:rPr>
-          <w:rFonts w:ascii="Times New Roman" w:cs="Times New Roman" w:eastAsia="Times New Roman" w:hAnsi="Times New Roman"/>
-          <w:sz w:val="24"/>
-          <w:szCs w:val="24"/>
-          <w:rtl w:val="0"/>
-        </w:rPr>
-        <w:t xml:space="preserve">Median: the data are already in order, so the median is the (15 + 1)/2 = 8th value</w:t>
-      </w:r>
-    </w:p>
-    <w:p>
-      <w:pPr>
-        <w:rPr>
-          <w:rFonts w:ascii="Times New Roman" w:cs="Times New Roman" w:eastAsia="Times New Roman" w:hAnsi="Times New Roman"/>
-          <w:sz w:val="24"/>
-          <w:szCs w:val="24"/>
-        </w:rPr>
-      </w:pPr>
-      <w:r>
-        <w:rPr>
-          <w:rFonts w:ascii="Times New Roman" w:cs="Times New Roman" w:eastAsia="Times New Roman" w:hAnsi="Times New Roman"/>
-          <w:sz w:val="24"/>
-          <w:szCs w:val="24"/>
-          <w:rtl w:val="0"/>
-        </w:rPr>
-        <w:t xml:space="preserve">= 24 minutes</w:t>
-      </w:r>
-    </w:p>
-    <w:p>
-      <w:pPr>
-        <w:rPr>
-          <w:rFonts w:ascii="Times New Roman" w:cs="Times New Roman" w:eastAsia="Times New Roman" w:hAnsi="Times New Roman"/>
-          <w:sz w:val="24"/>
-          <w:szCs w:val="24"/>
-        </w:rPr>
-      </w:pPr>
-    </w:p>
-    <w:p>
-      <w:pPr>
-        <w:rPr>
-          <w:rFonts w:ascii="Times New Roman" w:cs="Times New Roman" w:eastAsia="Times New Roman" w:hAnsi="Times New Roman"/>
-          <w:sz w:val="24"/>
-          <w:szCs w:val="24"/>
-        </w:rPr>
-      </w:pPr>
-      <w:r>
-        <w:rPr>
-          <w:rFonts w:ascii="Times New Roman" w:cs="Times New Roman" w:eastAsia="Times New Roman" w:hAnsi="Times New Roman"/>
-          <w:sz w:val="24"/>
-          <w:szCs w:val="24"/>
-          <w:rtl w:val="0"/>
-        </w:rPr>
-        <w:t xml:space="preserve">Mode: 24 appears 3 times, more than any other value</w:t>
-      </w:r>
-    </w:p>
-    <w:p>
-      <w:pPr>
-        <w:rPr>
-          <w:rFonts w:ascii="Times New Roman" w:cs="Times New Roman" w:eastAsia="Times New Roman" w:hAnsi="Times New Roman"/>
-          <w:sz w:val="24"/>
-          <w:szCs w:val="24"/>
-        </w:rPr>
-      </w:pPr>
-      <w:r>
-        <w:rPr>
-          <w:rFonts w:ascii="Times New Roman" w:cs="Times New Roman" w:eastAsia="Times New Roman" w:hAnsi="Times New Roman"/>
-          <w:sz w:val="24"/>
-          <w:szCs w:val="24"/>
-          <w:rtl w:val="0"/>
-        </w:rPr>
-        <w:t xml:space="preserve">= 24 minutes</w:t>
-      </w:r>
-    </w:p>
-    <w:p>
-      <w:pPr>
-        <w:rPr>
-          <w:rFonts w:ascii="Times New Roman" w:cs="Times New Roman" w:eastAsia="Times New Roman" w:hAnsi="Times New Roman"/>
-          <w:sz w:val="24"/>
-          <w:szCs w:val="24"/>
-        </w:rPr>
-      </w:pPr>
-    </w:p>
-    <w:p>
-      <w:pPr>
-        <w:rPr>
-          <w:rFonts w:ascii="Times New Roman" w:cs="Times New Roman" w:eastAsia="Times New Roman" w:hAnsi="Times New Roman"/>
-          <w:sz w:val="24"/>
-          <w:szCs w:val="24"/>
-        </w:rPr>
-      </w:pPr>
-      <w:r>
-        <w:rPr>
-          <w:rFonts w:ascii="Times New Roman" w:cs="Times New Roman" w:eastAsia="Times New Roman" w:hAnsi="Times New Roman"/>
-          <w:sz w:val="24"/>
-          <w:szCs w:val="24"/>
-          <w:rtl w:val="0"/>
-        </w:rPr>
-        <w:t xml:space="preserve">We would report the median (24 minutes) as the most representative commute time. The 45-minute commute is an outlier that pulls the mean up to 25, which is higher than 9 of the 15 workers' times. The median isn't affected by how extreme that one value is.</w:t>
-      </w:r>
-    </w:p>
-    <w:p>
-      <w:pPr>
-        <w:rPr>
-          <w:rFonts w:ascii="Times New Roman" w:cs="Times New Roman" w:eastAsia="Times New Roman" w:hAnsi="Times New Roman"/>
-          <w:sz w:val="24"/>
-          <w:szCs w:val="24"/>
-        </w:rPr>
-      </w:pPr>
-    </w:p>
-    <w:p>
-      <w:pPr>
-        <w:rPr>
-          <w:rFonts w:ascii="Times New Roman" w:cs="Times New Roman" w:eastAsia="Times New Roman" w:hAnsi="Times New Roman"/>
-          <w:sz w:val="24"/>
-          <w:szCs w:val="24"/>
-        </w:rPr>
-      </w:pPr>
-      <w:r>
-        <w:rPr>
-          <w:rFonts w:ascii="Times New Roman" w:cs="Times New Roman" w:eastAsia="Times New Roman" w:hAnsi="Times New Roman"/>
-          <w:sz w:val="24"/>
-          <w:szCs w:val="24"/>
-          <w:rtl w:val="0"/>
-        </w:rPr>
-        <w:t xml:space="preserve">2. Sample variance and standard deviation</w:t>
-      </w:r>
-    </w:p>
-    <w:tbl>
-      <w:tblPr>
-        <w:tblW w:w="9360" w:type="dxa"/>
-        <w:tblBorders>
-          <w:top w:val="single" w:sz="4" w:space="0" w:color="000000"/>
-          <w:left w:val="single" w:sz="4" w:space="0" w:color="000000"/>
-          <w:bottom w:val="single" w:sz="4" w:space="0" w:color="000000"/>
-          <w:right w:val="single" w:sz="4" w:space="0" w:color="000000"/>
-          <w:insideH w:val="single" w:sz="4" w:space="0" w:color="000000"/>
-          <w:insideV w:val="single" w:sz="4" w:space="0" w:color="000000"/>
-        </w:tblBorders>
-        <w:tblLayout w:type="fixed"/>
-        <w:tblCellMar>
-          <w:left w:w="100" w:type="dxa"/>
-          <w:right w:w="100" w:type="dxa"/>
-        </w:tblCellMar>
-      </w:tblPr>
-      <w:tblGrid>
-        <w:gridCol w:w="3120"/>
-        <w:gridCol w:w="3120"/>
-        <w:gridCol w:w="3120"/>
-      </w:tblGrid>
-      <w:tr>
-        <w:tc>
-          <w:tcPr>
-            <w:tcW w:w="3120" w:type="dxa"/>
-            <w:shd w:val="clear" w:color="auto" w:fill="E7E6E6"/>
-          </w:tcPr>
-          <w:p>
-            <w:pPr>
-              <w:rPr>
-                <w:rFonts w:ascii="Times New Roman" w:cs="Times New Roman" w:eastAsia="Times New Roman" w:hAnsi="Times New Roman"/>
-                <w:sz w:val="24"/>
-                <w:szCs w:val="24"/>
-              </w:rPr>
-            </w:pPr>
-            <w:r>
-              <w:rPr>
-                <w:rFonts w:ascii="Times New Roman" w:cs="Times New Roman" w:eastAsia="Times New Roman" w:hAnsi="Times New Roman"/>
-                <w:b/>
-                <w:bCs/>
-                <w:sz w:val="24"/>
-                <w:szCs w:val="24"/>
-                <w:rtl w:val="0"/>
-              </w:rPr>
-              <w:t xml:space="preserve">x</w:t>
-            </w:r>
-          </w:p>
-        </w:tc>
-        <w:tc>
-          <w:tcPr>
-            <w:tcW w:w="3120" w:type="dxa"/>
-            <w:shd w:val="clear" w:color="auto" w:fill="E7E6E6"/>
-          </w:tcPr>
-          <w:p>
-            <w:pPr>
-              <w:rPr>
-                <w:rFonts w:ascii="Times New Roman" w:cs="Times New Roman" w:eastAsia="Times New Roman" w:hAnsi="Times New Roman"/>
-                <w:sz w:val="24"/>
-                <w:szCs w:val="24"/>
-              </w:rPr>
-            </w:pPr>
-            <w:r>
-              <w:rPr>
-                <w:rFonts w:ascii="Times New Roman" w:cs="Times New Roman" w:eastAsia="Times New Roman" w:hAnsi="Times New Roman"/>
-                <w:b/>
-                <w:bCs/>
-                <w:sz w:val="24"/>
-                <w:szCs w:val="24"/>
-                <w:rtl w:val="0"/>
-              </w:rPr>
-              <w:t xml:space="preserve">x - 25</w:t>
-            </w:r>
-          </w:p>
-        </w:tc>
-        <w:tc>
-          <w:tcPr>
-            <w:tcW w:w="3120" w:type="dxa"/>
-            <w:shd w:val="clear" w:color="auto" w:fill="E7E6E6"/>
-          </w:tcPr>
-          <w:p>
-            <w:pPr>
-              <w:rPr>
-                <w:rFonts w:ascii="Times New Roman" w:cs="Times New Roman" w:eastAsia="Times New Roman" w:hAnsi="Times New Roman"/>
-                <w:sz w:val="24"/>
-                <w:szCs w:val="24"/>
-              </w:rPr>
-            </w:pPr>
-            <w:r>
-              <w:rPr>
-                <w:rFonts w:ascii="Times New Roman" w:cs="Times New Roman" w:eastAsia="Times New Roman" w:hAnsi="Times New Roman"/>
-                <w:b/>
-                <w:bCs/>
-                <w:sz w:val="24"/>
-                <w:szCs w:val="24"/>
-                <w:rtl w:val="0"/>
-              </w:rPr>
-              <w:t xml:space="preserve">(x - 25)^2</w:t>
-            </w:r>
-          </w:p>
-        </w:tc>
-      </w:tr>
-      <w:tr>
-        <w:tc>
-          <w:tcPr>
-            <w:tcW w:w="3120" w:type="dxa"/>
-          </w:tcPr>
-          <w:p>
-            <w:pPr>
-              <w:rPr>
-                <w:rFonts w:ascii="Times New Roman" w:cs="Times New Roman" w:eastAsia="Times New Roman" w:hAnsi="Times New Roman"/>
-                <w:sz w:val="24"/>
-                <w:szCs w:val="24"/>
-              </w:rPr>
-            </w:pPr>
-            <w:r>
-              <w:rPr>
-                <w:rFonts w:ascii="Times New Roman" w:cs="Times New Roman" w:eastAsia="Times New Roman" w:hAnsi="Times New Roman"/>
-                <w:sz w:val="24"/>
-                <w:szCs w:val="24"/>
-                <w:rtl w:val="0"/>
-              </w:rPr>
-              <w:t xml:space="preserve">17</w:t>
-            </w:r>
-          </w:p>
-        </w:tc>
-        <w:tc>
-          <w:tcPr>
-            <w:tcW w:w="3120" w:type="dxa"/>
-          </w:tcPr>
-          <w:p>
-            <w:pPr>
-              <w:rPr>
-                <w:rFonts w:ascii="Times New Roman" w:cs="Times New Roman" w:eastAsia="Times New Roman" w:hAnsi="Times New Roman"/>
-                <w:sz w:val="24"/>
-                <w:szCs w:val="24"/>
-              </w:rPr>
-            </w:pPr>
-            <w:r>
-              <w:rPr>
-                <w:rFonts w:ascii="Times New Roman" w:cs="Times New Roman" w:eastAsia="Times New Roman" w:hAnsi="Times New Roman"/>
-                <w:sz w:val="24"/>
-                <w:szCs w:val="24"/>
-                <w:rtl w:val="0"/>
-              </w:rPr>
-              <w:t xml:space="preserve">-8</w:t>
-            </w:r>
-          </w:p>
-        </w:tc>
-        <w:tc>
-          <w:tcPr>
-            <w:tcW w:w="3120" w:type="dxa"/>
-          </w:tcPr>
-          <w:p>
-            <w:pPr>
-              <w:rPr>
-                <w:rFonts w:ascii="Times New Roman" w:cs="Times New Roman" w:eastAsia="Times New Roman" w:hAnsi="Times New Roman"/>
-                <w:sz w:val="24"/>
-                <w:szCs w:val="24"/>
-              </w:rPr>
-            </w:pPr>
-            <w:r>
-              <w:rPr>
-                <w:rFonts w:ascii="Times New Roman" w:cs="Times New Roman" w:eastAsia="Times New Roman" w:hAnsi="Times New Roman"/>
-                <w:sz w:val="24"/>
-                <w:szCs w:val="24"/>
-                <w:rtl w:val="0"/>
-              </w:rPr>
-              <w:t xml:space="preserve">64</w:t>
-            </w:r>
-          </w:p>
-        </w:tc>
-      </w:tr>
-      <w:tr>
-        <w:tc>
-          <w:tcPr>
-            <w:tcW w:w="3120" w:type="dxa"/>
-          </w:tcPr>
-          <w:p>
-            <w:pPr>
-              <w:rPr>
-                <w:rFonts w:ascii="Times New Roman" w:cs="Times New Roman" w:eastAsia="Times New Roman" w:hAnsi="Times New Roman"/>
-                <w:sz w:val="24"/>
-                <w:szCs w:val="24"/>
-              </w:rPr>
-            </w:pPr>
-            <w:r>
-              <w:rPr>
-                <w:rFonts w:ascii="Times New Roman" w:cs="Times New Roman" w:eastAsia="Times New Roman" w:hAnsi="Times New Roman"/>
-                <w:sz w:val="24"/>
-                <w:szCs w:val="24"/>
-                <w:rtl w:val="0"/>
-              </w:rPr>
-              <w:t xml:space="preserve">19</w:t>
-            </w:r>
-          </w:p>
-        </w:tc>
-        <w:tc>
-          <w:tcPr>
-            <w:tcW w:w="3120" w:type="dxa"/>
-          </w:tcPr>
-          <w:p>
-            <w:pPr>
-              <w:rPr>
-                <w:rFonts w:ascii="Times New Roman" w:cs="Times New Roman" w:eastAsia="Times New Roman" w:hAnsi="Times New Roman"/>
-                <w:sz w:val="24"/>
-                <w:szCs w:val="24"/>
-              </w:rPr>
-            </w:pPr>
-            <w:r>
-              <w:rPr>
-                <w:rFonts w:ascii="Times New Roman" w:cs="Times New Roman" w:eastAsia="Times New Roman" w:hAnsi="Times New Roman"/>
-                <w:sz w:val="24"/>
-                <w:szCs w:val="24"/>
-                <w:rtl w:val="0"/>
-              </w:rPr>
-              <w:t xml:space="preserve">-6</w:t>
-            </w:r>
-          </w:p>
-        </w:tc>
-        <w:tc>
-          <w:tcPr>
-            <w:tcW w:w="3120" w:type="dxa"/>
-          </w:tcPr>
-          <w:p>
-            <w:pPr>
-              <w:rPr>
-                <w:rFonts w:ascii="Times New Roman" w:cs="Times New Roman" w:eastAsia="Times New Roman" w:hAnsi="Times New Roman"/>
-                <w:sz w:val="24"/>
-                <w:szCs w:val="24"/>
-              </w:rPr>
-            </w:pPr>
-            <w:r>
-              <w:rPr>
-                <w:rFonts w:ascii="Times New Roman" w:cs="Times New Roman" w:eastAsia="Times New Roman" w:hAnsi="Times New Roman"/>
-                <w:sz w:val="24"/>
-                <w:szCs w:val="24"/>
-                <w:rtl w:val="0"/>
-              </w:rPr>
-              <w:t xml:space="preserve">36</w:t>
-            </w:r>
-          </w:p>
-        </w:tc>
-      </w:tr>
-      <w:tr>
-        <w:tc>
-          <w:tcPr>
-            <w:tcW w:w="3120" w:type="dxa"/>
-          </w:tcPr>
-          <w:p>
-            <w:pPr>
-              <w:rPr>
-                <w:rFonts w:ascii="Times New Roman" w:cs="Times New Roman" w:eastAsia="Times New Roman" w:hAnsi="Times New Roman"/>
-                <w:sz w:val="24"/>
-                <w:szCs w:val="24"/>
-              </w:rPr>
-            </w:pPr>
-            <w:r>
-              <w:rPr>
-                <w:rFonts w:ascii="Times New Roman" w:cs="Times New Roman" w:eastAsia="Times New Roman" w:hAnsi="Times New Roman"/>
-                <w:sz w:val="24"/>
-                <w:szCs w:val="24"/>
-                <w:rtl w:val="0"/>
-              </w:rPr>
-              <w:t xml:space="preserve">20</w:t>
-            </w:r>
-          </w:p>
-        </w:tc>
-        <w:tc>
-          <w:tcPr>
-            <w:tcW w:w="3120" w:type="dxa"/>
-          </w:tcPr>
-          <w:p>
-            <w:pPr>
-              <w:rPr>
-                <w:rFonts w:ascii="Times New Roman" w:cs="Times New Roman" w:eastAsia="Times New Roman" w:hAnsi="Times New Roman"/>
-                <w:sz w:val="24"/>
-                <w:szCs w:val="24"/>
-              </w:rPr>
-            </w:pPr>
-            <w:r>
-              <w:rPr>
-                <w:rFonts w:ascii="Times New Roman" w:cs="Times New Roman" w:eastAsia="Times New Roman" w:hAnsi="Times New Roman"/>
-                <w:sz w:val="24"/>
-                <w:szCs w:val="24"/>
-                <w:rtl w:val="0"/>
-              </w:rPr>
-              <w:t xml:space="preserve">-5</w:t>
-            </w:r>
-          </w:p>
-        </w:tc>
-        <w:tc>
-          <w:tcPr>
-            <w:tcW w:w="3120" w:type="dxa"/>
-          </w:tcPr>
-          <w:p>
-            <w:pPr>
-              <w:rPr>
-                <w:rFonts w:ascii="Times New Roman" w:cs="Times New Roman" w:eastAsia="Times New Roman" w:hAnsi="Times New Roman"/>
-                <w:sz w:val="24"/>
-                <w:szCs w:val="24"/>
-              </w:rPr>
-            </w:pPr>
-            <w:r>
-              <w:rPr>
-                <w:rFonts w:ascii="Times New Roman" w:cs="Times New Roman" w:eastAsia="Times New Roman" w:hAnsi="Times New Roman"/>
-                <w:sz w:val="24"/>
-                <w:szCs w:val="24"/>
-                <w:rtl w:val="0"/>
-              </w:rPr>
-              <w:t xml:space="preserve">25</w:t>
-            </w:r>
-          </w:p>
-        </w:tc>
-      </w:tr>
-      <w:tr>
-        <w:tc>
-          <w:tcPr>
-            <w:tcW w:w="3120" w:type="dxa"/>
-          </w:tcPr>
-          <w:p>
-            <w:pPr>
-              <w:rPr>
-                <w:rFonts w:ascii="Times New Roman" w:cs="Times New Roman" w:eastAsia="Times New Roman" w:hAnsi="Times New Roman"/>
-                <w:sz w:val="24"/>
-                <w:szCs w:val="24"/>
-              </w:rPr>
-            </w:pPr>
-            <w:r>
-              <w:rPr>
-                <w:rFonts w:ascii="Times New Roman" w:cs="Times New Roman" w:eastAsia="Times New Roman" w:hAnsi="Times New Roman"/>
-                <w:sz w:val="24"/>
-                <w:szCs w:val="24"/>
-                <w:rtl w:val="0"/>
-              </w:rPr>
-              <w:t xml:space="preserve">21</w:t>
-            </w:r>
-          </w:p>
-        </w:tc>
-        <w:tc>
-          <w:tcPr>
-            <w:tcW w:w="3120" w:type="dxa"/>
-          </w:tcPr>
-          <w:p>
-            <w:pPr>
-              <w:rPr>
-                <w:rFonts w:ascii="Times New Roman" w:cs="Times New Roman" w:eastAsia="Times New Roman" w:hAnsi="Times New Roman"/>
-                <w:sz w:val="24"/>
-                <w:szCs w:val="24"/>
-              </w:rPr>
-            </w:pPr>
-            <w:r>
-              <w:rPr>
-                <w:rFonts w:ascii="Times New Roman" w:cs="Times New Roman" w:eastAsia="Times New Roman" w:hAnsi="Times New Roman"/>
-                <w:sz w:val="24"/>
-                <w:szCs w:val="24"/>
-                <w:rtl w:val="0"/>
-              </w:rPr>
-              <w:t xml:space="preserve">-4</w:t>
-            </w:r>
-          </w:p>
-        </w:tc>
-        <w:tc>
-          <w:tcPr>
-            <w:tcW w:w="3120" w:type="dxa"/>
-          </w:tcPr>
-          <w:p>
-            <w:pPr>
-              <w:rPr>
-                <w:rFonts w:ascii="Times New Roman" w:cs="Times New Roman" w:eastAsia="Times New Roman" w:hAnsi="Times New Roman"/>
-                <w:sz w:val="24"/>
-                <w:szCs w:val="24"/>
-              </w:rPr>
-            </w:pPr>
-            <w:r>
-              <w:rPr>
-                <w:rFonts w:ascii="Times New Roman" w:cs="Times New Roman" w:eastAsia="Times New Roman" w:hAnsi="Times New Roman"/>
-                <w:sz w:val="24"/>
-                <w:szCs w:val="24"/>
-                <w:rtl w:val="0"/>
-              </w:rPr>
-              <w:t xml:space="preserve">16</w:t>
-            </w:r>
-          </w:p>
-        </w:tc>
-      </w:tr>
-      <w:tr>
-        <w:tc>
-          <w:tcPr>
-            <w:tcW w:w="3120" w:type="dxa"/>
-          </w:tcPr>
-          <w:p>
-            <w:pPr>
-              <w:rPr>
-                <w:rFonts w:ascii="Times New Roman" w:cs="Times New Roman" w:eastAsia="Times New Roman" w:hAnsi="Times New Roman"/>
-                <w:sz w:val="24"/>
-                <w:szCs w:val="24"/>
-              </w:rPr>
-            </w:pPr>
-            <w:r>
-              <w:rPr>
-                <w:rFonts w:ascii="Times New Roman" w:cs="Times New Roman" w:eastAsia="Times New Roman" w:hAnsi="Times New Roman"/>
-                <w:sz w:val="24"/>
-                <w:szCs w:val="24"/>
-                <w:rtl w:val="0"/>
-              </w:rPr>
-              <w:t xml:space="preserve">22</w:t>
-            </w:r>
-          </w:p>
-        </w:tc>
-        <w:tc>
-          <w:tcPr>
-            <w:tcW w:w="3120" w:type="dxa"/>
-          </w:tcPr>
-          <w:p>
-            <w:pPr>
-              <w:rPr>
-                <w:rFonts w:ascii="Times New Roman" w:cs="Times New Roman" w:eastAsia="Times New Roman" w:hAnsi="Times New Roman"/>
-                <w:sz w:val="24"/>
-                <w:szCs w:val="24"/>
-              </w:rPr>
-            </w:pPr>
-            <w:r>
-              <w:rPr>
-                <w:rFonts w:ascii="Times New Roman" w:cs="Times New Roman" w:eastAsia="Times New Roman" w:hAnsi="Times New Roman"/>
-                <w:sz w:val="24"/>
-                <w:szCs w:val="24"/>
-                <w:rtl w:val="0"/>
-              </w:rPr>
-              <w:t xml:space="preserve">-3</w:t>
-            </w:r>
-          </w:p>
-        </w:tc>
-        <w:tc>
-          <w:tcPr>
-            <w:tcW w:w="3120" w:type="dxa"/>
-          </w:tcPr>
-          <w:p>
-            <w:pPr>
-              <w:rPr>
-                <w:rFonts w:ascii="Times New Roman" w:cs="Times New Roman" w:eastAsia="Times New Roman" w:hAnsi="Times New Roman"/>
-                <w:sz w:val="24"/>
-                <w:szCs w:val="24"/>
-              </w:rPr>
-            </w:pPr>
-            <w:r>
-              <w:rPr>
-                <w:rFonts w:ascii="Times New Roman" w:cs="Times New Roman" w:eastAsia="Times New Roman" w:hAnsi="Times New Roman"/>
-                <w:sz w:val="24"/>
-                <w:szCs w:val="24"/>
-                <w:rtl w:val="0"/>
-              </w:rPr>
-              <w:t xml:space="preserve">9</w:t>
-            </w:r>
-          </w:p>
-        </w:tc>
-      </w:tr>
-      <w:tr>
-        <w:tc>
-          <w:tcPr>
-            <w:tcW w:w="3120" w:type="dxa"/>
-          </w:tcPr>
-          <w:p>
-            <w:pPr>
-              <w:rPr>
-                <w:rFonts w:ascii="Times New Roman" w:cs="Times New Roman" w:eastAsia="Times New Roman" w:hAnsi="Times New Roman"/>
-                <w:sz w:val="24"/>
-                <w:szCs w:val="24"/>
-              </w:rPr>
-            </w:pPr>
-            <w:r>
-              <w:rPr>
-                <w:rFonts w:ascii="Times New Roman" w:cs="Times New Roman" w:eastAsia="Times New Roman" w:hAnsi="Times New Roman"/>
-                <w:sz w:val="24"/>
-                <w:szCs w:val="24"/>
-                <w:rtl w:val="0"/>
-              </w:rPr>
-              <w:t xml:space="preserve">23</w:t>
-            </w:r>
-          </w:p>
-        </w:tc>
-        <w:tc>
-          <w:tcPr>
-            <w:tcW w:w="3120" w:type="dxa"/>
-          </w:tcPr>
-          <w:p>
-            <w:pPr>
-              <w:rPr>
-                <w:rFonts w:ascii="Times New Roman" w:cs="Times New Roman" w:eastAsia="Times New Roman" w:hAnsi="Times New Roman"/>
-                <w:sz w:val="24"/>
-                <w:szCs w:val="24"/>
-              </w:rPr>
-            </w:pPr>
-            <w:r>
-              <w:rPr>
-                <w:rFonts w:ascii="Times New Roman" w:cs="Times New Roman" w:eastAsia="Times New Roman" w:hAnsi="Times New Roman"/>
-                <w:sz w:val="24"/>
-                <w:szCs w:val="24"/>
-                <w:rtl w:val="0"/>
-              </w:rPr>
-              <w:t xml:space="preserve">-2</w:t>
-            </w:r>
-          </w:p>
-        </w:tc>
-        <w:tc>
-          <w:tcPr>
-            <w:tcW w:w="3120" w:type="dxa"/>
-          </w:tcPr>
-          <w:p>
-            <w:pPr>
-              <w:rPr>
-                <w:rFonts w:ascii="Times New Roman" w:cs="Times New Roman" w:eastAsia="Times New Roman" w:hAnsi="Times New Roman"/>
-                <w:sz w:val="24"/>
-                <w:szCs w:val="24"/>
-              </w:rPr>
-            </w:pPr>
-            <w:r>
-              <w:rPr>
-                <w:rFonts w:ascii="Times New Roman" w:cs="Times New Roman" w:eastAsia="Times New Roman" w:hAnsi="Times New Roman"/>
-                <w:sz w:val="24"/>
-                <w:szCs w:val="24"/>
-                <w:rtl w:val="0"/>
-              </w:rPr>
-              <w:t xml:space="preserve">4</w:t>
-            </w:r>
-          </w:p>
-        </w:tc>
-      </w:tr>
-      <w:tr>
-        <w:tc>
-          <w:tcPr>
-            <w:tcW w:w="3120" w:type="dxa"/>
-          </w:tcPr>
-          <w:p>
-            <w:pPr>
-              <w:rPr>
-                <w:rFonts w:ascii="Times New Roman" w:cs="Times New Roman" w:eastAsia="Times New Roman" w:hAnsi="Times New Roman"/>
-                <w:sz w:val="24"/>
-                <w:szCs w:val="24"/>
-              </w:rPr>
-            </w:pPr>
-            <w:r>
-              <w:rPr>
-                <w:rFonts w:ascii="Times New Roman" w:cs="Times New Roman" w:eastAsia="Times New Roman" w:hAnsi="Times New Roman"/>
-                <w:sz w:val="24"/>
-                <w:szCs w:val="24"/>
-                <w:rtl w:val="0"/>
-              </w:rPr>
-              <w:t xml:space="preserve">24</w:t>
-            </w:r>
-          </w:p>
-        </w:tc>
-        <w:tc>
-          <w:tcPr>
-            <w:tcW w:w="3120" w:type="dxa"/>
-          </w:tcPr>
-          <w:p>
-            <w:pPr>
-              <w:rPr>
-                <w:rFonts w:ascii="Times New Roman" w:cs="Times New Roman" w:eastAsia="Times New Roman" w:hAnsi="Times New Roman"/>
-                <w:sz w:val="24"/>
-                <w:szCs w:val="24"/>
-              </w:rPr>
-            </w:pPr>
-            <w:r>
-              <w:rPr>
-                <w:rFonts w:ascii="Times New Roman" w:cs="Times New Roman" w:eastAsia="Times New Roman" w:hAnsi="Times New Roman"/>
-                <w:sz w:val="24"/>
-                <w:szCs w:val="24"/>
-                <w:rtl w:val="0"/>
-              </w:rPr>
-              <w:t xml:space="preserve">-1</w:t>
-            </w:r>
-          </w:p>
-        </w:tc>
-        <w:tc>
-          <w:tcPr>
-            <w:tcW w:w="3120" w:type="dxa"/>
-          </w:tcPr>
-          <w:p>
-            <w:pPr>
-              <w:rPr>
-                <w:rFonts w:ascii="Times New Roman" w:cs="Times New Roman" w:eastAsia="Times New Roman" w:hAnsi="Times New Roman"/>
-                <w:sz w:val="24"/>
-                <w:szCs w:val="24"/>
-              </w:rPr>
-            </w:pPr>
-            <w:r>
-              <w:rPr>
-                <w:rFonts w:ascii="Times New Roman" w:cs="Times New Roman" w:eastAsia="Times New Roman" w:hAnsi="Times New Roman"/>
-                <w:sz w:val="24"/>
-                <w:szCs w:val="24"/>
-                <w:rtl w:val="0"/>
-              </w:rPr>
-              <w:t xml:space="preserve">1</w:t>
-            </w:r>
-          </w:p>
-        </w:tc>
-      </w:tr>
-      <w:tr>
-        <w:tc>
-          <w:tcPr>
-            <w:tcW w:w="3120" w:type="dxa"/>
-          </w:tcPr>
-          <w:p>
-            <w:pPr>
-              <w:rPr>
-                <w:rFonts w:ascii="Times New Roman" w:cs="Times New Roman" w:eastAsia="Times New Roman" w:hAnsi="Times New Roman"/>
-                <w:sz w:val="24"/>
-                <w:szCs w:val="24"/>
-              </w:rPr>
-            </w:pPr>
-            <w:r>
-              <w:rPr>
-                <w:rFonts w:ascii="Times New Roman" w:cs="Times New Roman" w:eastAsia="Times New Roman" w:hAnsi="Times New Roman"/>
-                <w:sz w:val="24"/>
-                <w:szCs w:val="24"/>
-                <w:rtl w:val="0"/>
-              </w:rPr>
-              <w:t xml:space="preserve">24</w:t>
-            </w:r>
-          </w:p>
-        </w:tc>
-        <w:tc>
-          <w:tcPr>
-            <w:tcW w:w="3120" w:type="dxa"/>
-          </w:tcPr>
-          <w:p>
-            <w:pPr>
-              <w:rPr>
-                <w:rFonts w:ascii="Times New Roman" w:cs="Times New Roman" w:eastAsia="Times New Roman" w:hAnsi="Times New Roman"/>
-                <w:sz w:val="24"/>
-                <w:szCs w:val="24"/>
-              </w:rPr>
-            </w:pPr>
-            <w:r>
-              <w:rPr>
-                <w:rFonts w:ascii="Times New Roman" w:cs="Times New Roman" w:eastAsia="Times New Roman" w:hAnsi="Times New Roman"/>
-                <w:sz w:val="24"/>
-                <w:szCs w:val="24"/>
-                <w:rtl w:val="0"/>
-              </w:rPr>
-              <w:t xml:space="preserve">-1</w:t>
-            </w:r>
-          </w:p>
-        </w:tc>
-        <w:tc>
-          <w:tcPr>
-            <w:tcW w:w="3120" w:type="dxa"/>
-          </w:tcPr>
-          <w:p>
-            <w:pPr>
-              <w:rPr>
-                <w:rFonts w:ascii="Times New Roman" w:cs="Times New Roman" w:eastAsia="Times New Roman" w:hAnsi="Times New Roman"/>
-                <w:sz w:val="24"/>
-                <w:szCs w:val="24"/>
-              </w:rPr>
-            </w:pPr>
-            <w:r>
-              <w:rPr>
-                <w:rFonts w:ascii="Times New Roman" w:cs="Times New Roman" w:eastAsia="Times New Roman" w:hAnsi="Times New Roman"/>
-                <w:sz w:val="24"/>
-                <w:szCs w:val="24"/>
-                <w:rtl w:val="0"/>
-              </w:rPr>
-              <w:t xml:space="preserve">1</w:t>
-            </w:r>
-          </w:p>
-        </w:tc>
-      </w:tr>
-      <w:tr>
-        <w:tc>
-          <w:tcPr>
-            <w:tcW w:w="3120" w:type="dxa"/>
-          </w:tcPr>
-          <w:p>
-            <w:pPr>
-              <w:rPr>
-                <w:rFonts w:ascii="Times New Roman" w:cs="Times New Roman" w:eastAsia="Times New Roman" w:hAnsi="Times New Roman"/>
-                <w:sz w:val="24"/>
-                <w:szCs w:val="24"/>
-              </w:rPr>
-            </w:pPr>
-            <w:r>
-              <w:rPr>
-                <w:rFonts w:ascii="Times New Roman" w:cs="Times New Roman" w:eastAsia="Times New Roman" w:hAnsi="Times New Roman"/>
-                <w:sz w:val="24"/>
-                <w:szCs w:val="24"/>
-                <w:rtl w:val="0"/>
-              </w:rPr>
-              <w:t xml:space="preserve">24</w:t>
-            </w:r>
-          </w:p>
-        </w:tc>
-        <w:tc>
-          <w:tcPr>
-            <w:tcW w:w="3120" w:type="dxa"/>
-          </w:tcPr>
-          <w:p>
-            <w:pPr>
-              <w:rPr>
-                <w:rFonts w:ascii="Times New Roman" w:cs="Times New Roman" w:eastAsia="Times New Roman" w:hAnsi="Times New Roman"/>
-                <w:sz w:val="24"/>
-                <w:szCs w:val="24"/>
-              </w:rPr>
-            </w:pPr>
-            <w:r>
-              <w:rPr>
-                <w:rFonts w:ascii="Times New Roman" w:cs="Times New Roman" w:eastAsia="Times New Roman" w:hAnsi="Times New Roman"/>
-                <w:sz w:val="24"/>
-                <w:szCs w:val="24"/>
-                <w:rtl w:val="0"/>
-              </w:rPr>
-              <w:t xml:space="preserve">-1</w:t>
-            </w:r>
-          </w:p>
-        </w:tc>
-        <w:tc>
-          <w:tcPr>
-            <w:tcW w:w="3120" w:type="dxa"/>
-          </w:tcPr>
-          <w:p>
-            <w:pPr>
-              <w:rPr>
-                <w:rFonts w:ascii="Times New Roman" w:cs="Times New Roman" w:eastAsia="Times New Roman" w:hAnsi="Times New Roman"/>
-                <w:sz w:val="24"/>
-                <w:szCs w:val="24"/>
-              </w:rPr>
-            </w:pPr>
-            <w:r>
-              <w:rPr>
-                <w:rFonts w:ascii="Times New Roman" w:cs="Times New Roman" w:eastAsia="Times New Roman" w:hAnsi="Times New Roman"/>
-                <w:sz w:val="24"/>
-                <w:szCs w:val="24"/>
-                <w:rtl w:val="0"/>
-              </w:rPr>
-              <w:t xml:space="preserve">1</w:t>
-            </w:r>
-          </w:p>
-        </w:tc>
-      </w:tr>
-      <w:tr>
-        <w:tc>
-          <w:tcPr>
-            <w:tcW w:w="3120" w:type="dxa"/>
-          </w:tcPr>
-          <w:p>
-            <w:pPr>
-              <w:rPr>
-                <w:rFonts w:ascii="Times New Roman" w:cs="Times New Roman" w:eastAsia="Times New Roman" w:hAnsi="Times New Roman"/>
-                <w:sz w:val="24"/>
-                <w:szCs w:val="24"/>
-              </w:rPr>
-            </w:pPr>
-            <w:r>
-              <w:rPr>
-                <w:rFonts w:ascii="Times New Roman" w:cs="Times New Roman" w:eastAsia="Times New Roman" w:hAnsi="Times New Roman"/>
-                <w:sz w:val="24"/>
-                <w:szCs w:val="24"/>
-                <w:rtl w:val="0"/>
-              </w:rPr>
-              <w:t xml:space="preserve">25</w:t>
-            </w:r>
-          </w:p>
-        </w:tc>
-        <w:tc>
-          <w:tcPr>
-            <w:tcW w:w="3120" w:type="dxa"/>
-          </w:tcPr>
-          <w:p>
-            <w:pPr>
-              <w:rPr>
-                <w:rFonts w:ascii="Times New Roman" w:cs="Times New Roman" w:eastAsia="Times New Roman" w:hAnsi="Times New Roman"/>
-                <w:sz w:val="24"/>
-                <w:szCs w:val="24"/>
-              </w:rPr>
-            </w:pPr>
-            <w:r>
-              <w:rPr>
-                <w:rFonts w:ascii="Times New Roman" w:cs="Times New Roman" w:eastAsia="Times New Roman" w:hAnsi="Times New Roman"/>
-                <w:sz w:val="24"/>
-                <w:szCs w:val="24"/>
-                <w:rtl w:val="0"/>
-              </w:rPr>
-              <w:t xml:space="preserve">0</w:t>
-            </w:r>
-          </w:p>
-        </w:tc>
-        <w:tc>
-          <w:tcPr>
-            <w:tcW w:w="3120" w:type="dxa"/>
-          </w:tcPr>
-          <w:p>
-            <w:pPr>
-              <w:rPr>
-                <w:rFonts w:ascii="Times New Roman" w:cs="Times New Roman" w:eastAsia="Times New Roman" w:hAnsi="Times New Roman"/>
-                <w:sz w:val="24"/>
-                <w:szCs w:val="24"/>
-              </w:rPr>
-            </w:pPr>
-            <w:r>
-              <w:rPr>
-                <w:rFonts w:ascii="Times New Roman" w:cs="Times New Roman" w:eastAsia="Times New Roman" w:hAnsi="Times New Roman"/>
-                <w:sz w:val="24"/>
-                <w:szCs w:val="24"/>
-                <w:rtl w:val="0"/>
-              </w:rPr>
-              <w:t xml:space="preserve">0</w:t>
-            </w:r>
-          </w:p>
-        </w:tc>
-      </w:tr>
-      <w:tr>
-        <w:tc>
-          <w:tcPr>
-            <w:tcW w:w="3120" w:type="dxa"/>
-          </w:tcPr>
-          <w:p>
-            <w:pPr>
-              <w:rPr>
-                <w:rFonts w:ascii="Times New Roman" w:cs="Times New Roman" w:eastAsia="Times New Roman" w:hAnsi="Times New Roman"/>
-                <w:sz w:val="24"/>
-                <w:szCs w:val="24"/>
-              </w:rPr>
-            </w:pPr>
-            <w:r>
-              <w:rPr>
-                <w:rFonts w:ascii="Times New Roman" w:cs="Times New Roman" w:eastAsia="Times New Roman" w:hAnsi="Times New Roman"/>
-                <w:sz w:val="24"/>
-                <w:szCs w:val="24"/>
-                <w:rtl w:val="0"/>
-              </w:rPr>
-              <w:t xml:space="preserve">26</w:t>
-            </w:r>
-          </w:p>
-        </w:tc>
-        <w:tc>
-          <w:tcPr>
-            <w:tcW w:w="3120" w:type="dxa"/>
-          </w:tcPr>
-          <w:p>
-            <w:pPr>
-              <w:rPr>
-                <w:rFonts w:ascii="Times New Roman" w:cs="Times New Roman" w:eastAsia="Times New Roman" w:hAnsi="Times New Roman"/>
-                <w:sz w:val="24"/>
-                <w:szCs w:val="24"/>
-              </w:rPr>
-            </w:pPr>
-            <w:r>
-              <w:rPr>
-                <w:rFonts w:ascii="Times New Roman" w:cs="Times New Roman" w:eastAsia="Times New Roman" w:hAnsi="Times New Roman"/>
-                <w:sz w:val="24"/>
-                <w:szCs w:val="24"/>
-                <w:rtl w:val="0"/>
-              </w:rPr>
-              <w:t xml:space="preserve">1</w:t>
-            </w:r>
-          </w:p>
-        </w:tc>
-        <w:tc>
-          <w:tcPr>
-            <w:tcW w:w="3120" w:type="dxa"/>
-          </w:tcPr>
-          <w:p>
-            <w:pPr>
-              <w:rPr>
-                <w:rFonts w:ascii="Times New Roman" w:cs="Times New Roman" w:eastAsia="Times New Roman" w:hAnsi="Times New Roman"/>
-                <w:sz w:val="24"/>
-                <w:szCs w:val="24"/>
-              </w:rPr>
-            </w:pPr>
-            <w:r>
-              <w:rPr>
-                <w:rFonts w:ascii="Times New Roman" w:cs="Times New Roman" w:eastAsia="Times New Roman" w:hAnsi="Times New Roman"/>
-                <w:sz w:val="24"/>
-                <w:szCs w:val="24"/>
-                <w:rtl w:val="0"/>
-              </w:rPr>
-              <w:t xml:space="preserve">1</w:t>
-            </w:r>
-          </w:p>
-        </w:tc>
-      </w:tr>
-      <w:tr>
-        <w:tc>
-          <w:tcPr>
-            <w:tcW w:w="3120" w:type="dxa"/>
-          </w:tcPr>
-          <w:p>
-            <w:pPr>
-              <w:rPr>
-                <w:rFonts w:ascii="Times New Roman" w:cs="Times New Roman" w:eastAsia="Times New Roman" w:hAnsi="Times New Roman"/>
-                <w:sz w:val="24"/>
-                <w:szCs w:val="24"/>
-              </w:rPr>
-            </w:pPr>
-            <w:r>
-              <w:rPr>
-                <w:rFonts w:ascii="Times New Roman" w:cs="Times New Roman" w:eastAsia="Times New Roman" w:hAnsi="Times New Roman"/>
-                <w:sz w:val="24"/>
-                <w:szCs w:val="24"/>
-                <w:rtl w:val="0"/>
-              </w:rPr>
-              <w:t xml:space="preserve">27</w:t>
-            </w:r>
-          </w:p>
-        </w:tc>
-        <w:tc>
-          <w:tcPr>
-            <w:tcW w:w="3120" w:type="dxa"/>
-          </w:tcPr>
-          <w:p>
-            <w:pPr>
-              <w:rPr>
-                <w:rFonts w:ascii="Times New Roman" w:cs="Times New Roman" w:eastAsia="Times New Roman" w:hAnsi="Times New Roman"/>
-                <w:sz w:val="24"/>
-                <w:szCs w:val="24"/>
-              </w:rPr>
-            </w:pPr>
-            <w:r>
-              <w:rPr>
-                <w:rFonts w:ascii="Times New Roman" w:cs="Times New Roman" w:eastAsia="Times New Roman" w:hAnsi="Times New Roman"/>
-                <w:sz w:val="24"/>
-                <w:szCs w:val="24"/>
-                <w:rtl w:val="0"/>
-              </w:rPr>
-              <w:t xml:space="preserve">2</w:t>
-            </w:r>
-          </w:p>
-        </w:tc>
-        <w:tc>
-          <w:tcPr>
-            <w:tcW w:w="3120" w:type="dxa"/>
-          </w:tcPr>
-          <w:p>
-            <w:pPr>
-              <w:rPr>
-                <w:rFonts w:ascii="Times New Roman" w:cs="Times New Roman" w:eastAsia="Times New Roman" w:hAnsi="Times New Roman"/>
-                <w:sz w:val="24"/>
-                <w:szCs w:val="24"/>
-              </w:rPr>
-            </w:pPr>
-            <w:r>
-              <w:rPr>
-                <w:rFonts w:ascii="Times New Roman" w:cs="Times New Roman" w:eastAsia="Times New Roman" w:hAnsi="Times New Roman"/>
-                <w:sz w:val="24"/>
-                <w:szCs w:val="24"/>
-                <w:rtl w:val="0"/>
-              </w:rPr>
-              <w:t xml:space="preserve">4</w:t>
-            </w:r>
-          </w:p>
-        </w:tc>
-      </w:tr>
-      <w:tr>
-        <w:tc>
-          <w:tcPr>
-            <w:tcW w:w="3120" w:type="dxa"/>
-          </w:tcPr>
-          <w:p>
-            <w:pPr>
-              <w:rPr>
-                <w:rFonts w:ascii="Times New Roman" w:cs="Times New Roman" w:eastAsia="Times New Roman" w:hAnsi="Times New Roman"/>
-                <w:sz w:val="24"/>
-                <w:szCs w:val="24"/>
-              </w:rPr>
-            </w:pPr>
-            <w:r>
-              <w:rPr>
-                <w:rFonts w:ascii="Times New Roman" w:cs="Times New Roman" w:eastAsia="Times New Roman" w:hAnsi="Times New Roman"/>
-                <w:sz w:val="24"/>
-                <w:szCs w:val="24"/>
-                <w:rtl w:val="0"/>
-              </w:rPr>
-              <w:t xml:space="preserve">28</w:t>
-            </w:r>
-          </w:p>
-        </w:tc>
-        <w:tc>
-          <w:tcPr>
-            <w:tcW w:w="3120" w:type="dxa"/>
-          </w:tcPr>
-          <w:p>
-            <w:pPr>
-              <w:rPr>
-                <w:rFonts w:ascii="Times New Roman" w:cs="Times New Roman" w:eastAsia="Times New Roman" w:hAnsi="Times New Roman"/>
-                <w:sz w:val="24"/>
-                <w:szCs w:val="24"/>
-              </w:rPr>
-            </w:pPr>
-            <w:r>
-              <w:rPr>
-                <w:rFonts w:ascii="Times New Roman" w:cs="Times New Roman" w:eastAsia="Times New Roman" w:hAnsi="Times New Roman"/>
-                <w:sz w:val="24"/>
-                <w:szCs w:val="24"/>
-                <w:rtl w:val="0"/>
-              </w:rPr>
-              <w:t xml:space="preserve">3</w:t>
-            </w:r>
-          </w:p>
-        </w:tc>
-        <w:tc>
-          <w:tcPr>
-            <w:tcW w:w="3120" w:type="dxa"/>
-          </w:tcPr>
-          <w:p>
-            <w:pPr>
-              <w:rPr>
-                <w:rFonts w:ascii="Times New Roman" w:cs="Times New Roman" w:eastAsia="Times New Roman" w:hAnsi="Times New Roman"/>
-                <w:sz w:val="24"/>
-                <w:szCs w:val="24"/>
-              </w:rPr>
-            </w:pPr>
-            <w:r>
-              <w:rPr>
-                <w:rFonts w:ascii="Times New Roman" w:cs="Times New Roman" w:eastAsia="Times New Roman" w:hAnsi="Times New Roman"/>
-                <w:sz w:val="24"/>
-                <w:szCs w:val="24"/>
-                <w:rtl w:val="0"/>
-              </w:rPr>
-              <w:t xml:space="preserve">9</w:t>
-            </w:r>
-          </w:p>
-        </w:tc>
-      </w:tr>
-      <w:tr>
-        <w:tc>
-          <w:tcPr>
-            <w:tcW w:w="3120" w:type="dxa"/>
-          </w:tcPr>
-          <w:p>
-            <w:pPr>
-              <w:rPr>
-                <w:rFonts w:ascii="Times New Roman" w:cs="Times New Roman" w:eastAsia="Times New Roman" w:hAnsi="Times New Roman"/>
-                <w:sz w:val="24"/>
-                <w:szCs w:val="24"/>
-              </w:rPr>
-            </w:pPr>
-            <w:r>
-              <w:rPr>
-                <w:rFonts w:ascii="Times New Roman" w:cs="Times New Roman" w:eastAsia="Times New Roman" w:hAnsi="Times New Roman"/>
-                <w:sz w:val="24"/>
-                <w:szCs w:val="24"/>
-                <w:rtl w:val="0"/>
-              </w:rPr>
-              <w:t xml:space="preserve">30</w:t>
-            </w:r>
-          </w:p>
-        </w:tc>
-        <w:tc>
-          <w:tcPr>
-            <w:tcW w:w="3120" w:type="dxa"/>
-          </w:tcPr>
-          <w:p>
-            <w:pPr>
-              <w:rPr>
-                <w:rFonts w:ascii="Times New Roman" w:cs="Times New Roman" w:eastAsia="Times New Roman" w:hAnsi="Times New Roman"/>
-                <w:sz w:val="24"/>
-                <w:szCs w:val="24"/>
-              </w:rPr>
-            </w:pPr>
-            <w:r>
-              <w:rPr>
-                <w:rFonts w:ascii="Times New Roman" w:cs="Times New Roman" w:eastAsia="Times New Roman" w:hAnsi="Times New Roman"/>
-                <w:sz w:val="24"/>
-                <w:szCs w:val="24"/>
-                <w:rtl w:val="0"/>
-              </w:rPr>
-              <w:t xml:space="preserve">5</w:t>
-            </w:r>
-          </w:p>
-        </w:tc>
-        <w:tc>
-          <w:tcPr>
-            <w:tcW w:w="3120" w:type="dxa"/>
-          </w:tcPr>
-          <w:p>
-            <w:pPr>
-              <w:rPr>
-                <w:rFonts w:ascii="Times New Roman" w:cs="Times New Roman" w:eastAsia="Times New Roman" w:hAnsi="Times New Roman"/>
-                <w:sz w:val="24"/>
-                <w:szCs w:val="24"/>
-              </w:rPr>
-            </w:pPr>
-            <w:r>
-              <w:rPr>
-                <w:rFonts w:ascii="Times New Roman" w:cs="Times New Roman" w:eastAsia="Times New Roman" w:hAnsi="Times New Roman"/>
-                <w:sz w:val="24"/>
-                <w:szCs w:val="24"/>
-                <w:rtl w:val="0"/>
-              </w:rPr>
-              <w:t xml:space="preserve">25</w:t>
-            </w:r>
-          </w:p>
-        </w:tc>
-      </w:tr>
-      <w:tr>
-        <w:tc>
-          <w:tcPr>
-            <w:tcW w:w="3120" w:type="dxa"/>
-          </w:tcPr>
-          <w:p>
-            <w:pPr>
-              <w:rPr>
-                <w:rFonts w:ascii="Times New Roman" w:cs="Times New Roman" w:eastAsia="Times New Roman" w:hAnsi="Times New Roman"/>
-                <w:sz w:val="24"/>
-                <w:szCs w:val="24"/>
-              </w:rPr>
-            </w:pPr>
-            <w:r>
-              <w:rPr>
-                <w:rFonts w:ascii="Times New Roman" w:cs="Times New Roman" w:eastAsia="Times New Roman" w:hAnsi="Times New Roman"/>
-                <w:sz w:val="24"/>
-                <w:szCs w:val="24"/>
-                <w:rtl w:val="0"/>
-              </w:rPr>
-              <w:t xml:space="preserve">45</w:t>
-            </w:r>
-          </w:p>
-        </w:tc>
-        <w:tc>
-          <w:tcPr>
-            <w:tcW w:w="3120" w:type="dxa"/>
-          </w:tcPr>
-          <w:p>
-            <w:pPr>
-              <w:rPr>
-                <w:rFonts w:ascii="Times New Roman" w:cs="Times New Roman" w:eastAsia="Times New Roman" w:hAnsi="Times New Roman"/>
-                <w:sz w:val="24"/>
-                <w:szCs w:val="24"/>
-              </w:rPr>
-            </w:pPr>
-            <w:r>
-              <w:rPr>
-                <w:rFonts w:ascii="Times New Roman" w:cs="Times New Roman" w:eastAsia="Times New Roman" w:hAnsi="Times New Roman"/>
-                <w:sz w:val="24"/>
-                <w:szCs w:val="24"/>
-                <w:rtl w:val="0"/>
-              </w:rPr>
-              <w:t xml:space="preserve">20</w:t>
-            </w:r>
-          </w:p>
-        </w:tc>
-        <w:tc>
-          <w:tcPr>
-            <w:tcW w:w="3120" w:type="dxa"/>
-          </w:tcPr>
-          <w:p>
-            <w:pPr>
-              <w:rPr>
-                <w:rFonts w:ascii="Times New Roman" w:cs="Times New Roman" w:eastAsia="Times New Roman" w:hAnsi="Times New Roman"/>
-                <w:sz w:val="24"/>
-                <w:szCs w:val="24"/>
-              </w:rPr>
-            </w:pPr>
-            <w:r>
-              <w:rPr>
-                <w:rFonts w:ascii="Times New Roman" w:cs="Times New Roman" w:eastAsia="Times New Roman" w:hAnsi="Times New Roman"/>
-                <w:sz w:val="24"/>
-                <w:szCs w:val="24"/>
-                <w:rtl w:val="0"/>
-              </w:rPr>
-              <w:t xml:space="preserve">400</w:t>
-            </w:r>
-          </w:p>
-        </w:tc>
-      </w:tr>
-      <w:tr>
-        <w:tc>
-          <w:tcPr>
-            <w:tcW w:w="3120" w:type="dxa"/>
-          </w:tcPr>
-          <w:p>
-            <w:pPr>
-              <w:rPr>
-                <w:rFonts w:ascii="Times New Roman" w:cs="Times New Roman" w:eastAsia="Times New Roman" w:hAnsi="Times New Roman"/>
-                <w:sz w:val="24"/>
-                <w:szCs w:val="24"/>
-              </w:rPr>
-            </w:pPr>
-            <w:r>
-              <w:rPr>
-                <w:rFonts w:ascii="Times New Roman" w:cs="Times New Roman" w:eastAsia="Times New Roman" w:hAnsi="Times New Roman"/>
-                <w:sz w:val="24"/>
-                <w:szCs w:val="24"/>
-                <w:rtl w:val="0"/>
-              </w:rPr>
-              <w:t xml:space="preserve">Sum</w:t>
-            </w:r>
-          </w:p>
-        </w:tc>
-        <w:tc>
-          <w:tcPr>
-            <w:tcW w:w="3120" w:type="dxa"/>
-          </w:tcPr>
-          <w:p>
-            <w:pPr>
-              <w:rPr>
-                <w:rFonts w:ascii="Times New Roman" w:cs="Times New Roman" w:eastAsia="Times New Roman" w:hAnsi="Times New Roman"/>
-                <w:sz w:val="24"/>
-                <w:szCs w:val="24"/>
-              </w:rPr>
-            </w:pPr>
-            <w:r>
-              <w:rPr>
-                <w:rFonts w:ascii="Times New Roman" w:cs="Times New Roman" w:eastAsia="Times New Roman" w:hAnsi="Times New Roman"/>
-                <w:sz w:val="24"/>
-                <w:szCs w:val="24"/>
-                <w:rtl w:val="0"/>
-              </w:rPr>
-              <w:t xml:space="preserve">0</w:t>
-            </w:r>
-          </w:p>
-        </w:tc>
-        <w:tc>
-          <w:tcPr>
-            <w:tcW w:w="3120" w:type="dxa"/>
-          </w:tcPr>
-          <w:p>
-            <w:pPr>
-              <w:rPr>
-                <w:rFonts w:ascii="Times New Roman" w:cs="Times New Roman" w:eastAsia="Times New Roman" w:hAnsi="Times New Roman"/>
-                <w:sz w:val="24"/>
-                <w:szCs w:val="24"/>
-              </w:rPr>
-            </w:pPr>
-            <w:r>
-              <w:rPr>
-                <w:rFonts w:ascii="Times New Roman" w:cs="Times New Roman" w:eastAsia="Times New Roman" w:hAnsi="Times New Roman"/>
-                <w:sz w:val="24"/>
-                <w:szCs w:val="24"/>
-                <w:rtl w:val="0"/>
-              </w:rPr>
-              <w:t xml:space="preserve">596</w:t>
-            </w:r>
-          </w:p>
-        </w:tc>
-      </w:tr>
-    </w:tbl>
-    <w:p>
-      <w:pPr>
-        <w:rPr>
-          <w:rFonts w:ascii="Times New Roman" w:cs="Times New Roman" w:eastAsia="Times New Roman" w:hAnsi="Times New Roman"/>
-          <w:sz w:val="24"/>
-          <w:szCs w:val="24"/>
-        </w:rPr>
-      </w:pPr>
-    </w:p>
-    <w:p>
-      <w:pPr>
-        <w:rPr>
-          <w:rFonts w:ascii="Times New Roman" w:cs="Times New Roman" w:eastAsia="Times New Roman" w:hAnsi="Times New Roman"/>
-          <w:sz w:val="24"/>
-          <w:szCs w:val="24"/>
-        </w:rPr>
-      </w:pPr>
-      <w:r>
-        <w:rPr>
-          <w:rFonts w:ascii="Times New Roman" w:cs="Times New Roman" w:eastAsia="Times New Roman" w:hAnsi="Times New Roman"/>
-          <w:sz w:val="24"/>
-          <w:szCs w:val="24"/>
-          <w:rtl w:val="0"/>
-        </w:rPr>
-        <w:t xml:space="preserve">s^2 = Σ(x - mean)^2 / (n - 1)</w:t>
-      </w:r>
-    </w:p>
-    <w:p>
-      <w:pPr>
-        <w:rPr>
-          <w:rFonts w:ascii="Times New Roman" w:cs="Times New Roman" w:eastAsia="Times New Roman" w:hAnsi="Times New Roman"/>
-          <w:sz w:val="24"/>
-          <w:szCs w:val="24"/>
-        </w:rPr>
-      </w:pPr>
-      <w:r>
-        <w:rPr>
-          <w:rFonts w:ascii="Times New Roman" w:cs="Times New Roman" w:eastAsia="Times New Roman" w:hAnsi="Times New Roman"/>
-          <w:sz w:val="24"/>
-          <w:szCs w:val="24"/>
-          <w:rtl w:val="0"/>
-        </w:rPr>
-        <w:t xml:space="preserve">= 596 / 14</w:t>
-      </w:r>
-    </w:p>
-    <w:p>
-      <w:pPr>
-        <w:rPr>
-          <w:rFonts w:ascii="Times New Roman" w:cs="Times New Roman" w:eastAsia="Times New Roman" w:hAnsi="Times New Roman"/>
-          <w:sz w:val="24"/>
-          <w:szCs w:val="24"/>
-        </w:rPr>
-      </w:pPr>
-      <w:r>
-        <w:rPr>
-          <w:rFonts w:ascii="Times New Roman" w:cs="Times New Roman" w:eastAsia="Times New Roman" w:hAnsi="Times New Roman"/>
-          <w:sz w:val="24"/>
-          <w:szCs w:val="24"/>
-          <w:rtl w:val="0"/>
-        </w:rPr>
-        <w:t xml:space="preserve">= 42.57 minutes^2</w:t>
-      </w:r>
-    </w:p>
-    <w:p>
-      <w:pPr>
-        <w:rPr>
-          <w:rFonts w:ascii="Times New Roman" w:cs="Times New Roman" w:eastAsia="Times New Roman" w:hAnsi="Times New Roman"/>
-          <w:sz w:val="24"/>
-          <w:szCs w:val="24"/>
-        </w:rPr>
-      </w:pPr>
-    </w:p>
-    <w:p>
-      <w:pPr>
-        <w:rPr>
-          <w:rFonts w:ascii="Times New Roman" w:cs="Times New Roman" w:eastAsia="Times New Roman" w:hAnsi="Times New Roman"/>
-          <w:sz w:val="24"/>
-          <w:szCs w:val="24"/>
-        </w:rPr>
-      </w:pPr>
-      <w:r>
-        <w:rPr>
-          <w:rFonts w:ascii="Times New Roman" w:cs="Times New Roman" w:eastAsia="Times New Roman" w:hAnsi="Times New Roman"/>
-          <w:sz w:val="24"/>
-          <w:szCs w:val="24"/>
-          <w:rtl w:val="0"/>
-        </w:rPr>
-        <w:t xml:space="preserve">s = sqrt(42.57)</w:t>
-      </w:r>
-    </w:p>
-    <w:p>
-      <w:pPr>
-        <w:rPr>
-          <w:rFonts w:ascii="Times New Roman" w:cs="Times New Roman" w:eastAsia="Times New Roman" w:hAnsi="Times New Roman"/>
-          <w:sz w:val="24"/>
-          <w:szCs w:val="24"/>
-        </w:rPr>
-      </w:pPr>
-      <w:r>
-        <w:rPr>
-          <w:rFonts w:ascii="Times New Roman" w:cs="Times New Roman" w:eastAsia="Times New Roman" w:hAnsi="Times New Roman"/>
-          <w:sz w:val="24"/>
-          <w:szCs w:val="24"/>
-          <w:rtl w:val="0"/>
-        </w:rPr>
-        <w:t xml:space="preserve">= 6.52 minutes</w:t>
-      </w:r>
-    </w:p>
-    <w:p>
-      <w:pPr>
-        <w:rPr>
-          <w:rFonts w:ascii="Times New Roman" w:cs="Times New Roman" w:eastAsia="Times New Roman" w:hAnsi="Times New Roman"/>
-          <w:sz w:val="24"/>
-          <w:szCs w:val="24"/>
-        </w:rPr>
-      </w:pPr>
-    </w:p>
-    <w:p>
-      <w:pPr>
-        <w:rPr>
-          <w:rFonts w:ascii="Times New Roman" w:cs="Times New Roman" w:eastAsia="Times New Roman" w:hAnsi="Times New Roman"/>
-          <w:sz w:val="24"/>
-          <w:szCs w:val="24"/>
-        </w:rPr>
-      </w:pPr>
-      <w:r>
-        <w:rPr>
-          <w:rFonts w:ascii="Times New Roman" w:cs="Times New Roman" w:eastAsia="Times New Roman" w:hAnsi="Times New Roman"/>
-          <w:sz w:val="24"/>
-          <w:szCs w:val="24"/>
-          <w:rtl w:val="0"/>
-        </w:rPr>
-        <w:t xml:space="preserve">3. Removing the 45-minute observation (n = 14)</w:t>
-      </w:r>
-    </w:p>
-    <w:p>
-      <w:pPr>
-        <w:rPr>
-          <w:rFonts w:ascii="Times New Roman" w:cs="Times New Roman" w:eastAsia="Times New Roman" w:hAnsi="Times New Roman"/>
-          <w:sz w:val="24"/>
-          <w:szCs w:val="24"/>
-        </w:rPr>
-      </w:pPr>
-      <w:r>
-        <w:rPr>
-          <w:rFonts w:ascii="Times New Roman" w:cs="Times New Roman" w:eastAsia="Times New Roman" w:hAnsi="Times New Roman"/>
-          <w:sz w:val="24"/>
-          <w:szCs w:val="24"/>
-          <w:rtl w:val="0"/>
-        </w:rPr>
-        <w:t xml:space="preserve">Mean = (375 - 45) / 14</w:t>
-      </w:r>
-    </w:p>
-    <w:p>
-      <w:pPr>
-        <w:rPr>
-          <w:rFonts w:ascii="Times New Roman" w:cs="Times New Roman" w:eastAsia="Times New Roman" w:hAnsi="Times New Roman"/>
-          <w:sz w:val="24"/>
-          <w:szCs w:val="24"/>
-        </w:rPr>
-      </w:pPr>
-      <w:r>
-        <w:rPr>
-          <w:rFonts w:ascii="Times New Roman" w:cs="Times New Roman" w:eastAsia="Times New Roman" w:hAnsi="Times New Roman"/>
-          <w:sz w:val="24"/>
-          <w:szCs w:val="24"/>
-          <w:rtl w:val="0"/>
-        </w:rPr>
-        <w:t xml:space="preserve">= 330 / 14</w:t>
-      </w:r>
-    </w:p>
-    <w:p>
-      <w:pPr>
-        <w:rPr>
-          <w:rFonts w:ascii="Times New Roman" w:cs="Times New Roman" w:eastAsia="Times New Roman" w:hAnsi="Times New Roman"/>
-          <w:sz w:val="24"/>
-          <w:szCs w:val="24"/>
-        </w:rPr>
-      </w:pPr>
-      <w:r>
-        <w:rPr>
-          <w:rFonts w:ascii="Times New Roman" w:cs="Times New Roman" w:eastAsia="Times New Roman" w:hAnsi="Times New Roman"/>
-          <w:sz w:val="24"/>
-          <w:szCs w:val="24"/>
-          <w:rtl w:val="0"/>
-        </w:rPr>
-        <w:t xml:space="preserve">= 23.57 minutes</w:t>
-      </w:r>
-    </w:p>
-    <w:p>
-      <w:pPr>
-        <w:rPr>
-          <w:rFonts w:ascii="Times New Roman" w:cs="Times New Roman" w:eastAsia="Times New Roman" w:hAnsi="Times New Roman"/>
-          <w:sz w:val="24"/>
-          <w:szCs w:val="24"/>
-        </w:rPr>
-      </w:pPr>
-    </w:p>
-    <w:p>
-      <w:pPr>
-        <w:rPr>
-          <w:rFonts w:ascii="Times New Roman" w:cs="Times New Roman" w:eastAsia="Times New Roman" w:hAnsi="Times New Roman"/>
-          <w:sz w:val="24"/>
-          <w:szCs w:val="24"/>
-        </w:rPr>
-      </w:pPr>
-      <w:r>
-        <w:rPr>
-          <w:rFonts w:ascii="Times New Roman" w:cs="Times New Roman" w:eastAsia="Times New Roman" w:hAnsi="Times New Roman"/>
-          <w:sz w:val="24"/>
-          <w:szCs w:val="24"/>
-          <w:rtl w:val="0"/>
-        </w:rPr>
-        <w:t xml:space="preserve">Median = average of the 7th and 8th values</w:t>
-      </w:r>
-    </w:p>
-    <w:p>
-      <w:pPr>
-        <w:rPr>
-          <w:rFonts w:ascii="Times New Roman" w:cs="Times New Roman" w:eastAsia="Times New Roman" w:hAnsi="Times New Roman"/>
-          <w:sz w:val="24"/>
-          <w:szCs w:val="24"/>
-        </w:rPr>
-      </w:pPr>
-      <w:r>
-        <w:rPr>
-          <w:rFonts w:ascii="Times New Roman" w:cs="Times New Roman" w:eastAsia="Times New Roman" w:hAnsi="Times New Roman"/>
-          <w:sz w:val="24"/>
-          <w:szCs w:val="24"/>
-          <w:rtl w:val="0"/>
-        </w:rPr>
-        <w:t xml:space="preserve">= (24 + 24) / 2</w:t>
-      </w:r>
-    </w:p>
-    <w:p>
-      <w:pPr>
-        <w:rPr>
-          <w:rFonts w:ascii="Times New Roman" w:cs="Times New Roman" w:eastAsia="Times New Roman" w:hAnsi="Times New Roman"/>
-          <w:sz w:val="24"/>
-          <w:szCs w:val="24"/>
-        </w:rPr>
-      </w:pPr>
-      <w:r>
-        <w:rPr>
-          <w:rFonts w:ascii="Times New Roman" w:cs="Times New Roman" w:eastAsia="Times New Roman" w:hAnsi="Times New Roman"/>
-          <w:sz w:val="24"/>
-          <w:szCs w:val="24"/>
-          <w:rtl w:val="0"/>
-        </w:rPr>
-        <w:t xml:space="preserve">= 24 minutes</w:t>
-      </w:r>
-    </w:p>
-    <w:p>
-      <w:pPr>
-        <w:rPr>
-          <w:rFonts w:ascii="Times New Roman" w:cs="Times New Roman" w:eastAsia="Times New Roman" w:hAnsi="Times New Roman"/>
-          <w:sz w:val="24"/>
-          <w:szCs w:val="24"/>
-        </w:rPr>
-      </w:pPr>
-    </w:p>
-    <w:p>
-      <w:pPr>
-        <w:rPr>
-          <w:rFonts w:ascii="Times New Roman" w:cs="Times New Roman" w:eastAsia="Times New Roman" w:hAnsi="Times New Roman"/>
-          <w:sz w:val="24"/>
-          <w:szCs w:val="24"/>
-        </w:rPr>
-      </w:pPr>
-      <w:r>
-        <w:rPr>
-          <w:rFonts w:ascii="Times New Roman" w:cs="Times New Roman" w:eastAsia="Times New Roman" w:hAnsi="Times New Roman"/>
-          <w:sz w:val="24"/>
-          <w:szCs w:val="24"/>
-          <w:rtl w:val="0"/>
-        </w:rPr>
-        <w:t xml:space="preserve">Squared deviations from the new mean of 23.57:</w:t>
-      </w:r>
-    </w:p>
-    <w:p>
-      <w:pPr>
-        <w:rPr>
-          <w:rFonts w:ascii="Times New Roman" w:cs="Times New Roman" w:eastAsia="Times New Roman" w:hAnsi="Times New Roman"/>
-          <w:sz w:val="24"/>
-          <w:szCs w:val="24"/>
-        </w:rPr>
-      </w:pPr>
-      <w:r>
-        <w:rPr>
-          <w:rFonts w:ascii="Times New Roman" w:cs="Times New Roman" w:eastAsia="Times New Roman" w:hAnsi="Times New Roman"/>
-          <w:sz w:val="24"/>
-          <w:szCs w:val="24"/>
-          <w:rtl w:val="0"/>
-        </w:rPr>
-        <w:t xml:space="preserve">(17-23.57)^2 + (19-23.57)^2 + ... + (30-23.57)^2 = 167.43</w:t>
-      </w:r>
-    </w:p>
-    <w:p>
-      <w:pPr>
-        <w:rPr>
-          <w:rFonts w:ascii="Times New Roman" w:cs="Times New Roman" w:eastAsia="Times New Roman" w:hAnsi="Times New Roman"/>
-          <w:sz w:val="24"/>
-          <w:szCs w:val="24"/>
-        </w:rPr>
-      </w:pPr>
-      <w:r>
-        <w:rPr>
-          <w:rFonts w:ascii="Times New Roman" w:cs="Times New Roman" w:eastAsia="Times New Roman" w:hAnsi="Times New Roman"/>
-          <w:sz w:val="24"/>
-          <w:szCs w:val="24"/>
-          <w:rtl w:val="0"/>
-        </w:rPr>
-        <w:t xml:space="preserve">s^2 = 167.43 / 13</w:t>
-      </w:r>
-    </w:p>
-    <w:p>
-      <w:pPr>
-        <w:rPr>
-          <w:rFonts w:ascii="Times New Roman" w:cs="Times New Roman" w:eastAsia="Times New Roman" w:hAnsi="Times New Roman"/>
-          <w:sz w:val="24"/>
-          <w:szCs w:val="24"/>
-        </w:rPr>
-      </w:pPr>
-      <w:r>
-        <w:rPr>
-          <w:rFonts w:ascii="Times New Roman" w:cs="Times New Roman" w:eastAsia="Times New Roman" w:hAnsi="Times New Roman"/>
-          <w:sz w:val="24"/>
-          <w:szCs w:val="24"/>
-          <w:rtl w:val="0"/>
-        </w:rPr>
-        <w:t xml:space="preserve">= 12.88 minutes^2</w:t>
-      </w:r>
-    </w:p>
-    <w:p>
-      <w:pPr>
-        <w:rPr>
-          <w:rFonts w:ascii="Times New Roman" w:cs="Times New Roman" w:eastAsia="Times New Roman" w:hAnsi="Times New Roman"/>
-          <w:sz w:val="24"/>
-          <w:szCs w:val="24"/>
-        </w:rPr>
-      </w:pPr>
-      <w:r>
-        <w:rPr>
-          <w:rFonts w:ascii="Times New Roman" w:cs="Times New Roman" w:eastAsia="Times New Roman" w:hAnsi="Times New Roman"/>
-          <w:sz w:val="24"/>
-          <w:szCs w:val="24"/>
-          <w:rtl w:val="0"/>
-        </w:rPr>
-        <w:t xml:space="preserve">s = sqrt(12.88)</w:t>
-      </w:r>
-    </w:p>
-    <w:p>
-      <w:pPr>
-        <w:rPr>
-          <w:rFonts w:ascii="Times New Roman" w:cs="Times New Roman" w:eastAsia="Times New Roman" w:hAnsi="Times New Roman"/>
-          <w:sz w:val="24"/>
-          <w:szCs w:val="24"/>
-        </w:rPr>
-      </w:pPr>
-      <w:r>
-        <w:rPr>
-          <w:rFonts w:ascii="Times New Roman" w:cs="Times New Roman" w:eastAsia="Times New Roman" w:hAnsi="Times New Roman"/>
-          <w:sz w:val="24"/>
-          <w:szCs w:val="24"/>
-          <w:rtl w:val="0"/>
-        </w:rPr>
-        <w:t xml:space="preserve">= 3.59 minutes</w:t>
-      </w:r>
-    </w:p>
-    <w:p>
-      <w:pPr>
-        <w:rPr>
-          <w:rFonts w:ascii="Times New Roman" w:cs="Times New Roman" w:eastAsia="Times New Roman" w:hAnsi="Times New Roman"/>
-          <w:sz w:val="24"/>
-          <w:szCs w:val="24"/>
-        </w:rPr>
-      </w:pPr>
-    </w:p>
-    <w:p>
-      <w:pPr>
-        <w:rPr>
-          <w:rFonts w:ascii="Times New Roman" w:cs="Times New Roman" w:eastAsia="Times New Roman" w:hAnsi="Times New Roman"/>
-          <w:sz w:val="24"/>
-          <w:szCs w:val="24"/>
-        </w:rPr>
-      </w:pPr>
-      <w:r>
-        <w:rPr>
-          <w:rFonts w:ascii="Times New Roman" w:cs="Times New Roman" w:eastAsia="Times New Roman" w:hAnsi="Times New Roman"/>
-          <w:sz w:val="24"/>
-          <w:szCs w:val="24"/>
-          <w:rtl w:val="0"/>
-        </w:rPr>
-        <w:t xml:space="preserve">Comparison: dropping one large observation lowered the mean by 1.43 minutes (25 to 23.57) and almost cut the standard deviation in half (6.52 to 3.59). The median didn't change at all (24). The standard deviation is the most sensitive because it squares each deviation: the 45 alone contributed 400 of the 596 total. The mean is somewhat sensitive, and the median is robust to outliers.</w:t>
-      </w:r>
-    </w:p>
-    <w:p>
-      <w:pPr>
-        <w:rPr>
-          <w:rFonts w:ascii="Times New Roman" w:cs="Times New Roman" w:eastAsia="Times New Roman" w:hAnsi="Times New Roman"/>
-          <w:sz w:val="24"/>
-          <w:szCs w:val="24"/>
-        </w:rPr>
-      </w:pPr>
-    </w:p>
-    <w:p>
-      <w:pPr>
-        <w:rPr>
-          <w:rFonts w:ascii="Times New Roman" w:cs="Times New Roman" w:eastAsia="Times New Roman" w:hAnsi="Times New Roman"/>
-          <w:sz w:val="24"/>
-          <w:szCs w:val="24"/>
-        </w:rPr>
-      </w:pPr>
-      <w:r>
-        <w:rPr>
-          <w:rFonts w:ascii="Times New Roman" w:cs="Times New Roman" w:eastAsia="Times New Roman" w:hAnsi="Times New Roman"/>
-          <w:sz w:val="24"/>
-          <w:szCs w:val="24"/>
-          <w:rtl w:val="0"/>
-        </w:rPr>
-        <w:t xml:space="preserve">4. Converting minutes to seconds (multiply every value by 60)</w:t>
-      </w:r>
-    </w:p>
-    <w:p>
-      <w:pPr>
-        <w:rPr>
-          <w:rFonts w:ascii="Times New Roman" w:cs="Times New Roman" w:eastAsia="Times New Roman" w:hAnsi="Times New Roman"/>
-          <w:sz w:val="24"/>
-          <w:szCs w:val="24"/>
-        </w:rPr>
-      </w:pPr>
-      <w:r>
-        <w:rPr>
-          <w:rFonts w:ascii="Times New Roman" w:cs="Times New Roman" w:eastAsia="Times New Roman" w:hAnsi="Times New Roman"/>
-          <w:sz w:val="24"/>
-          <w:szCs w:val="24"/>
-          <w:rtl w:val="0"/>
-        </w:rPr>
-        <w:t xml:space="preserve">The mean, median, and SD are all multiplied by 60, and the variance is multiplied by 60^2 = 3,600.</w:t>
-      </w:r>
-    </w:p>
-    <w:p>
-      <w:pPr>
-        <w:rPr>
-          <w:rFonts w:ascii="Times New Roman" w:cs="Times New Roman" w:eastAsia="Times New Roman" w:hAnsi="Times New Roman"/>
-          <w:sz w:val="24"/>
-          <w:szCs w:val="24"/>
-        </w:rPr>
-      </w:pPr>
-      <w:r>
-        <w:rPr>
-          <w:rFonts w:ascii="Times New Roman" w:cs="Times New Roman" w:eastAsia="Times New Roman" w:hAnsi="Times New Roman"/>
-          <w:sz w:val="24"/>
-          <w:szCs w:val="24"/>
-          <w:rtl w:val="0"/>
-        </w:rPr>
-        <w:t xml:space="preserve">Mean = 25(60) = 1,500 seconds</w:t>
-      </w:r>
-    </w:p>
-    <w:p>
-      <w:pPr>
-        <w:rPr>
-          <w:rFonts w:ascii="Times New Roman" w:cs="Times New Roman" w:eastAsia="Times New Roman" w:hAnsi="Times New Roman"/>
-          <w:sz w:val="24"/>
-          <w:szCs w:val="24"/>
-        </w:rPr>
-      </w:pPr>
-      <w:r>
-        <w:rPr>
-          <w:rFonts w:ascii="Times New Roman" w:cs="Times New Roman" w:eastAsia="Times New Roman" w:hAnsi="Times New Roman"/>
-          <w:sz w:val="24"/>
-          <w:szCs w:val="24"/>
-          <w:rtl w:val="0"/>
-        </w:rPr>
-        <w:t xml:space="preserve">Median = 24(60) = 1,440 seconds</w:t>
-      </w:r>
-    </w:p>
-    <w:p>
-      <w:pPr>
-        <w:rPr>
-          <w:rFonts w:ascii="Times New Roman" w:cs="Times New Roman" w:eastAsia="Times New Roman" w:hAnsi="Times New Roman"/>
-          <w:sz w:val="24"/>
-          <w:szCs w:val="24"/>
-        </w:rPr>
-      </w:pPr>
-      <w:r>
-        <w:rPr>
-          <w:rFonts w:ascii="Times New Roman" w:cs="Times New Roman" w:eastAsia="Times New Roman" w:hAnsi="Times New Roman"/>
-          <w:sz w:val="24"/>
-          <w:szCs w:val="24"/>
-          <w:rtl w:val="0"/>
-        </w:rPr>
-        <w:t xml:space="preserve">Variance = 42.57(3,600) = 153,257.14 seconds^2</w:t>
-      </w:r>
-    </w:p>
-    <w:p>
-      <w:pPr>
-        <w:rPr>
-          <w:rFonts w:ascii="Times New Roman" w:cs="Times New Roman" w:eastAsia="Times New Roman" w:hAnsi="Times New Roman"/>
-          <w:sz w:val="24"/>
-          <w:szCs w:val="24"/>
-        </w:rPr>
-      </w:pPr>
-      <w:r>
-        <w:rPr>
-          <w:rFonts w:ascii="Times New Roman" w:cs="Times New Roman" w:eastAsia="Times New Roman" w:hAnsi="Times New Roman"/>
-          <w:sz w:val="24"/>
-          <w:szCs w:val="24"/>
-          <w:rtl w:val="0"/>
-        </w:rPr>
-        <w:t xml:space="preserve">SD = 6.52(60) = 391.48 seconds</w:t>
-      </w:r>
-    </w:p>
-    <w:p>
-      <w:pPr>
-        <w:rPr>
-          <w:rFonts w:ascii="Times New Roman" w:cs="Times New Roman" w:eastAsia="Times New Roman" w:hAnsi="Times New Roman"/>
-          <w:sz w:val="24"/>
-          <w:szCs w:val="24"/>
-        </w:rPr>
-      </w:pPr>
-    </w:p>
-    <w:p>
-      <w:r>
-        <w:br w:type="page"/>
-      </w:r>
-    </w:p>
-    <w:p>
-      <w:pPr>
-        <w:rPr>
-          <w:rFonts w:ascii="Times New Roman" w:cs="Times New Roman" w:eastAsia="Times New Roman" w:hAnsi="Times New Roman"/>
-          <w:sz w:val="24"/>
-          <w:szCs w:val="24"/>
-        </w:rPr>
-      </w:pPr>
-      <w:r>
-        <w:rPr>
-          <w:rFonts w:ascii="Times New Roman" w:cs="Times New Roman" w:eastAsia="Times New Roman" w:hAnsi="Times New Roman"/>
-          <w:sz w:val="24"/>
-          <w:szCs w:val="24"/>
-          <w:rtl w:val="0"/>
-        </w:rPr>
-        <w:t xml:space="preserve">Question 4</w:t>
-      </w:r>
-    </w:p>
-    <w:p>
-      <w:pPr>
-        <w:rPr>
-          <w:rFonts w:ascii="Times New Roman" w:cs="Times New Roman" w:eastAsia="Times New Roman" w:hAnsi="Times New Roman"/>
-          <w:sz w:val="24"/>
-          <w:szCs w:val="24"/>
-        </w:rPr>
-      </w:pPr>
-      <w:r>
-        <w:rPr>
-          <w:rFonts w:ascii="Times New Roman" w:cs="Times New Roman" w:eastAsia="Times New Roman" w:hAnsi="Times New Roman"/>
-          <w:sz w:val="24"/>
-          <w:szCs w:val="24"/>
-          <w:rtl w:val="0"/>
-        </w:rPr>
-        <w:t xml:space="preserve">Question 4: Comparing Normal Distributions</w:t>
-      </w:r>
-    </w:p>
-    <w:p>
-      <w:pPr>
-        <w:rPr>
-          <w:rFonts w:ascii="Times New Roman" w:cs="Times New Roman" w:eastAsia="Times New Roman" w:hAnsi="Times New Roman"/>
-          <w:sz w:val="24"/>
-          <w:szCs w:val="24"/>
-        </w:rPr>
-      </w:pPr>
-      <w:r>
-        <w:rPr>
-          <w:rFonts w:ascii="Times New Roman" w:cs="Times New Roman" w:eastAsia="Times New Roman" w:hAnsi="Times New Roman"/>
-          <w:sz w:val="24"/>
-          <w:szCs w:val="24"/>
-          <w:rtl w:val="0"/>
-        </w:rPr>
-        <w:t xml:space="preserve">X ~ N(72, 8^2): mean = 72, SD = 8</w:t>
-      </w:r>
-    </w:p>
-    <w:p>
-      <w:pPr>
-        <w:rPr>
-          <w:rFonts w:ascii="Times New Roman" w:cs="Times New Roman" w:eastAsia="Times New Roman" w:hAnsi="Times New Roman"/>
-          <w:sz w:val="24"/>
-          <w:szCs w:val="24"/>
-        </w:rPr>
-      </w:pPr>
-      <w:r>
-        <w:rPr>
-          <w:rFonts w:ascii="Times New Roman" w:cs="Times New Roman" w:eastAsia="Times New Roman" w:hAnsi="Times New Roman"/>
-          <w:sz w:val="24"/>
-          <w:szCs w:val="24"/>
-          <w:rtl w:val="0"/>
-        </w:rPr>
-        <w:t xml:space="preserve">Y ~ N(80, 5^2): mean = 80, SD = 5</w:t>
-      </w:r>
-    </w:p>
-    <w:p>
-      <w:pPr>
-        <w:rPr>
-          <w:rFonts w:ascii="Times New Roman" w:cs="Times New Roman" w:eastAsia="Times New Roman" w:hAnsi="Times New Roman"/>
-          <w:sz w:val="24"/>
-          <w:szCs w:val="24"/>
-        </w:rPr>
-      </w:pPr>
-    </w:p>
-    <w:p>
-      <w:pPr>
-        <w:rPr>
-          <w:rFonts w:ascii="Times New Roman" w:cs="Times New Roman" w:eastAsia="Times New Roman" w:hAnsi="Times New Roman"/>
-          <w:sz w:val="24"/>
-          <w:szCs w:val="24"/>
-        </w:rPr>
-      </w:pPr>
-      <w:r>
-        <w:rPr>
-          <w:rFonts w:ascii="Times New Roman" w:cs="Times New Roman" w:eastAsia="Times New Roman" w:hAnsi="Times New Roman"/>
-          <w:sz w:val="24"/>
-          <w:szCs w:val="24"/>
-          <w:rtl w:val="0"/>
-        </w:rPr>
-        <w:t xml:space="preserve">1. 68-95-99.7 rule (mean ± 1, 2, and 3 SDs)</w:t>
-      </w:r>
-    </w:p>
-    <w:tbl>
-      <w:tblPr>
-        <w:tblW w:w="9360" w:type="dxa"/>
-        <w:tblBorders>
-          <w:top w:val="single" w:sz="4" w:space="0" w:color="000000"/>
-          <w:left w:val="single" w:sz="4" w:space="0" w:color="000000"/>
-          <w:bottom w:val="single" w:sz="4" w:space="0" w:color="000000"/>
-          <w:right w:val="single" w:sz="4" w:space="0" w:color="000000"/>
-          <w:insideH w:val="single" w:sz="4" w:space="0" w:color="000000"/>
-          <w:insideV w:val="single" w:sz="4" w:space="0" w:color="000000"/>
-        </w:tblBorders>
-        <w:tblLayout w:type="fixed"/>
-        <w:tblCellMar>
-          <w:left w:w="100" w:type="dxa"/>
-          <w:right w:w="100" w:type="dxa"/>
-        </w:tblCellMar>
-      </w:tblPr>
-      <w:tblGrid>
-        <w:gridCol w:w="2340"/>
-        <w:gridCol w:w="2340"/>
-        <w:gridCol w:w="2340"/>
-        <w:gridCol w:w="2340"/>
-      </w:tblGrid>
-      <w:tr>
-        <w:tc>
-          <w:tcPr>
-            <w:tcW w:w="2340" w:type="dxa"/>
-            <w:shd w:val="clear" w:color="auto" w:fill="E7E6E6"/>
-          </w:tcPr>
-          <w:p>
-            <w:pPr>
-              <w:rPr>
-                <w:rFonts w:ascii="Times New Roman" w:cs="Times New Roman" w:eastAsia="Times New Roman" w:hAnsi="Times New Roman"/>
-                <w:sz w:val="24"/>
-                <w:szCs w:val="24"/>
-              </w:rPr>
-            </w:pPr>
-          </w:p>
-        </w:tc>
-        <w:tc>
-          <w:tcPr>
-            <w:tcW w:w="2340" w:type="dxa"/>
-            <w:shd w:val="clear" w:color="auto" w:fill="E7E6E6"/>
-          </w:tcPr>
-          <w:p>
-            <w:pPr>
-              <w:rPr>
-                <w:rFonts w:ascii="Times New Roman" w:cs="Times New Roman" w:eastAsia="Times New Roman" w:hAnsi="Times New Roman"/>
-                <w:sz w:val="24"/>
-                <w:szCs w:val="24"/>
-              </w:rPr>
-            </w:pPr>
-            <w:r>
-              <w:rPr>
-                <w:rFonts w:ascii="Times New Roman" w:cs="Times New Roman" w:eastAsia="Times New Roman" w:hAnsi="Times New Roman"/>
-                <w:b/>
-                <w:bCs/>
-                <w:sz w:val="24"/>
-                <w:szCs w:val="24"/>
-                <w:rtl w:val="0"/>
-              </w:rPr>
-              <w:t xml:space="preserve">68% (±1 SD)</w:t>
-            </w:r>
-          </w:p>
-        </w:tc>
-        <w:tc>
-          <w:tcPr>
-            <w:tcW w:w="2340" w:type="dxa"/>
-            <w:shd w:val="clear" w:color="auto" w:fill="E7E6E6"/>
-          </w:tcPr>
-          <w:p>
-            <w:pPr>
-              <w:rPr>
-                <w:rFonts w:ascii="Times New Roman" w:cs="Times New Roman" w:eastAsia="Times New Roman" w:hAnsi="Times New Roman"/>
-                <w:sz w:val="24"/>
-                <w:szCs w:val="24"/>
-              </w:rPr>
-            </w:pPr>
-            <w:r>
-              <w:rPr>
-                <w:rFonts w:ascii="Times New Roman" w:cs="Times New Roman" w:eastAsia="Times New Roman" w:hAnsi="Times New Roman"/>
-                <w:b/>
-                <w:bCs/>
-                <w:sz w:val="24"/>
-                <w:szCs w:val="24"/>
-                <w:rtl w:val="0"/>
-              </w:rPr>
-              <w:t xml:space="preserve">95% (±2 SD)</w:t>
-            </w:r>
-          </w:p>
-        </w:tc>
-        <w:tc>
-          <w:tcPr>
-            <w:tcW w:w="2340" w:type="dxa"/>
-            <w:shd w:val="clear" w:color="auto" w:fill="E7E6E6"/>
-          </w:tcPr>
-          <w:p>
-            <w:pPr>
-              <w:rPr>
-                <w:rFonts w:ascii="Times New Roman" w:cs="Times New Roman" w:eastAsia="Times New Roman" w:hAnsi="Times New Roman"/>
-                <w:sz w:val="24"/>
-                <w:szCs w:val="24"/>
-              </w:rPr>
-            </w:pPr>
-            <w:r>
-              <w:rPr>
-                <w:rFonts w:ascii="Times New Roman" w:cs="Times New Roman" w:eastAsia="Times New Roman" w:hAnsi="Times New Roman"/>
-                <w:b/>
-                <w:bCs/>
-                <w:sz w:val="24"/>
-                <w:szCs w:val="24"/>
-                <w:rtl w:val="0"/>
-              </w:rPr>
-              <w:t xml:space="preserve">99.7% (±3 SD)</w:t>
-            </w:r>
-          </w:p>
-        </w:tc>
-      </w:tr>
-      <w:tr>
-        <w:tc>
-          <w:tcPr>
-            <w:tcW w:w="2340" w:type="dxa"/>
-          </w:tcPr>
-          <w:p>
-            <w:pPr>
-              <w:rPr>
-                <w:rFonts w:ascii="Times New Roman" w:cs="Times New Roman" w:eastAsia="Times New Roman" w:hAnsi="Times New Roman"/>
-                <w:sz w:val="24"/>
-                <w:szCs w:val="24"/>
-              </w:rPr>
-            </w:pPr>
-            <w:r>
-              <w:rPr>
-                <w:rFonts w:ascii="Times New Roman" w:cs="Times New Roman" w:eastAsia="Times New Roman" w:hAnsi="Times New Roman"/>
-                <w:sz w:val="24"/>
-                <w:szCs w:val="24"/>
-                <w:rtl w:val="0"/>
-              </w:rPr>
-              <w:t xml:space="preserve">Exam X</w:t>
-            </w:r>
-          </w:p>
-        </w:tc>
-        <w:tc>
-          <w:tcPr>
-            <w:tcW w:w="2340" w:type="dxa"/>
-          </w:tcPr>
-          <w:p>
-            <w:pPr>
-              <w:rPr>
-                <w:rFonts w:ascii="Times New Roman" w:cs="Times New Roman" w:eastAsia="Times New Roman" w:hAnsi="Times New Roman"/>
-                <w:sz w:val="24"/>
-                <w:szCs w:val="24"/>
-              </w:rPr>
-            </w:pPr>
-            <w:r>
-              <w:rPr>
-                <w:rFonts w:ascii="Times New Roman" w:cs="Times New Roman" w:eastAsia="Times New Roman" w:hAnsi="Times New Roman"/>
-                <w:sz w:val="24"/>
-                <w:szCs w:val="24"/>
-                <w:rtl w:val="0"/>
-              </w:rPr>
-              <w:t xml:space="preserve">64 to 80</w:t>
-            </w:r>
-          </w:p>
-        </w:tc>
-        <w:tc>
-          <w:tcPr>
-            <w:tcW w:w="2340" w:type="dxa"/>
-          </w:tcPr>
-          <w:p>
-            <w:pPr>
-              <w:rPr>
-                <w:rFonts w:ascii="Times New Roman" w:cs="Times New Roman" w:eastAsia="Times New Roman" w:hAnsi="Times New Roman"/>
-                <w:sz w:val="24"/>
-                <w:szCs w:val="24"/>
-              </w:rPr>
-            </w:pPr>
-            <w:r>
-              <w:rPr>
-                <w:rFonts w:ascii="Times New Roman" w:cs="Times New Roman" w:eastAsia="Times New Roman" w:hAnsi="Times New Roman"/>
-                <w:sz w:val="24"/>
-                <w:szCs w:val="24"/>
-                <w:rtl w:val="0"/>
-              </w:rPr>
-              <w:t xml:space="preserve">56 to 88</w:t>
-            </w:r>
-          </w:p>
-        </w:tc>
-        <w:tc>
-          <w:tcPr>
-            <w:tcW w:w="2340" w:type="dxa"/>
-          </w:tcPr>
-          <w:p>
-            <w:pPr>
-              <w:rPr>
-                <w:rFonts w:ascii="Times New Roman" w:cs="Times New Roman" w:eastAsia="Times New Roman" w:hAnsi="Times New Roman"/>
-                <w:sz w:val="24"/>
-                <w:szCs w:val="24"/>
-              </w:rPr>
-            </w:pPr>
-            <w:r>
-              <w:rPr>
-                <w:rFonts w:ascii="Times New Roman" w:cs="Times New Roman" w:eastAsia="Times New Roman" w:hAnsi="Times New Roman"/>
-                <w:sz w:val="24"/>
-                <w:szCs w:val="24"/>
-                <w:rtl w:val="0"/>
-              </w:rPr>
-              <w:t xml:space="preserve">48 to 96</w:t>
-            </w:r>
-          </w:p>
-        </w:tc>
-      </w:tr>
-      <w:tr>
-        <w:tc>
-          <w:tcPr>
-            <w:tcW w:w="2340" w:type="dxa"/>
-          </w:tcPr>
-          <w:p>
-            <w:pPr>
-              <w:rPr>
-                <w:rFonts w:ascii="Times New Roman" w:cs="Times New Roman" w:eastAsia="Times New Roman" w:hAnsi="Times New Roman"/>
-                <w:sz w:val="24"/>
-                <w:szCs w:val="24"/>
-              </w:rPr>
-            </w:pPr>
-            <w:r>
-              <w:rPr>
-                <w:rFonts w:ascii="Times New Roman" w:cs="Times New Roman" w:eastAsia="Times New Roman" w:hAnsi="Times New Roman"/>
-                <w:sz w:val="24"/>
-                <w:szCs w:val="24"/>
-                <w:rtl w:val="0"/>
-              </w:rPr>
-              <w:t xml:space="preserve">Exam Y</w:t>
-            </w:r>
-          </w:p>
-        </w:tc>
-        <w:tc>
-          <w:tcPr>
-            <w:tcW w:w="2340" w:type="dxa"/>
-          </w:tcPr>
-          <w:p>
-            <w:pPr>
-              <w:rPr>
-                <w:rFonts w:ascii="Times New Roman" w:cs="Times New Roman" w:eastAsia="Times New Roman" w:hAnsi="Times New Roman"/>
-                <w:sz w:val="24"/>
-                <w:szCs w:val="24"/>
-              </w:rPr>
-            </w:pPr>
-            <w:r>
-              <w:rPr>
-                <w:rFonts w:ascii="Times New Roman" w:cs="Times New Roman" w:eastAsia="Times New Roman" w:hAnsi="Times New Roman"/>
-                <w:sz w:val="24"/>
-                <w:szCs w:val="24"/>
-                <w:rtl w:val="0"/>
-              </w:rPr>
-              <w:t xml:space="preserve">75 to 85</w:t>
-            </w:r>
-          </w:p>
-        </w:tc>
-        <w:tc>
-          <w:tcPr>
-            <w:tcW w:w="2340" w:type="dxa"/>
-          </w:tcPr>
-          <w:p>
-            <w:pPr>
-              <w:rPr>
-                <w:rFonts w:ascii="Times New Roman" w:cs="Times New Roman" w:eastAsia="Times New Roman" w:hAnsi="Times New Roman"/>
-                <w:sz w:val="24"/>
-                <w:szCs w:val="24"/>
-              </w:rPr>
-            </w:pPr>
-            <w:r>
-              <w:rPr>
-                <w:rFonts w:ascii="Times New Roman" w:cs="Times New Roman" w:eastAsia="Times New Roman" w:hAnsi="Times New Roman"/>
-                <w:sz w:val="24"/>
-                <w:szCs w:val="24"/>
-                <w:rtl w:val="0"/>
-              </w:rPr>
-              <w:t xml:space="preserve">70 to 90</w:t>
-            </w:r>
-          </w:p>
-        </w:tc>
-        <w:tc>
-          <w:tcPr>
-            <w:tcW w:w="2340" w:type="dxa"/>
-          </w:tcPr>
-          <w:p>
-            <w:pPr>
-              <w:rPr>
-                <w:rFonts w:ascii="Times New Roman" w:cs="Times New Roman" w:eastAsia="Times New Roman" w:hAnsi="Times New Roman"/>
-                <w:sz w:val="24"/>
-                <w:szCs w:val="24"/>
-              </w:rPr>
-            </w:pPr>
-            <w:r>
-              <w:rPr>
-                <w:rFonts w:ascii="Times New Roman" w:cs="Times New Roman" w:eastAsia="Times New Roman" w:hAnsi="Times New Roman"/>
-                <w:sz w:val="24"/>
-                <w:szCs w:val="24"/>
-                <w:rtl w:val="0"/>
-              </w:rPr>
-              <w:t xml:space="preserve">65 to 95</w:t>
-            </w:r>
-          </w:p>
-        </w:tc>
-      </w:tr>
-    </w:tbl>
-    <w:p>
-      <w:pPr>
-        <w:rPr>
-          <w:rFonts w:ascii="Times New Roman" w:cs="Times New Roman" w:eastAsia="Times New Roman" w:hAnsi="Times New Roman"/>
-          <w:sz w:val="24"/>
-          <w:szCs w:val="24"/>
-        </w:rPr>
-      </w:pPr>
-    </w:p>
-    <w:p>
-      <w:pPr>
-        <w:rPr>
-          <w:rFonts w:ascii="Times New Roman" w:cs="Times New Roman" w:eastAsia="Times New Roman" w:hAnsi="Times New Roman"/>
-          <w:sz w:val="24"/>
-          <w:szCs w:val="24"/>
-        </w:rPr>
-      </w:pPr>
-      <w:r>
-        <w:rPr>
-          <w:rFonts w:ascii="Times New Roman" w:cs="Times New Roman" w:eastAsia="Times New Roman" w:hAnsi="Times New Roman"/>
-          <w:sz w:val="24"/>
-          <w:szCs w:val="24"/>
-          <w:rtl w:val="0"/>
-        </w:rPr>
-        <w:t xml:space="preserve">2. z-scores</w:t>
-      </w:r>
-    </w:p>
-    <w:p>
-      <w:pPr>
-        <w:rPr>
-          <w:rFonts w:ascii="Times New Roman" w:cs="Times New Roman" w:eastAsia="Times New Roman" w:hAnsi="Times New Roman"/>
-          <w:sz w:val="24"/>
-          <w:szCs w:val="24"/>
-        </w:rPr>
-      </w:pPr>
-      <w:r>
-        <w:rPr>
-          <w:rFonts w:ascii="Times New Roman" w:cs="Times New Roman" w:eastAsia="Times New Roman" w:hAnsi="Times New Roman"/>
-          <w:sz w:val="24"/>
-          <w:szCs w:val="24"/>
-          <w:rtl w:val="0"/>
-        </w:rPr>
-        <w:t xml:space="preserve">z(X) = (84 - 72) / 8</w:t>
-      </w:r>
-    </w:p>
-    <w:p>
-      <w:pPr>
-        <w:rPr>
-          <w:rFonts w:ascii="Times New Roman" w:cs="Times New Roman" w:eastAsia="Times New Roman" w:hAnsi="Times New Roman"/>
-          <w:sz w:val="24"/>
-          <w:szCs w:val="24"/>
-        </w:rPr>
-      </w:pPr>
-      <w:r>
-        <w:rPr>
-          <w:rFonts w:ascii="Times New Roman" w:cs="Times New Roman" w:eastAsia="Times New Roman" w:hAnsi="Times New Roman"/>
-          <w:sz w:val="24"/>
-          <w:szCs w:val="24"/>
-          <w:rtl w:val="0"/>
-        </w:rPr>
-        <w:t xml:space="preserve">= 1.50</w:t>
-      </w:r>
-    </w:p>
-    <w:p>
-      <w:pPr>
-        <w:rPr>
-          <w:rFonts w:ascii="Times New Roman" w:cs="Times New Roman" w:eastAsia="Times New Roman" w:hAnsi="Times New Roman"/>
-          <w:sz w:val="24"/>
-          <w:szCs w:val="24"/>
-        </w:rPr>
-      </w:pPr>
-    </w:p>
-    <w:p>
-      <w:pPr>
-        <w:rPr>
-          <w:rFonts w:ascii="Times New Roman" w:cs="Times New Roman" w:eastAsia="Times New Roman" w:hAnsi="Times New Roman"/>
-          <w:sz w:val="24"/>
-          <w:szCs w:val="24"/>
-        </w:rPr>
-      </w:pPr>
-      <w:r>
-        <w:rPr>
-          <w:rFonts w:ascii="Times New Roman" w:cs="Times New Roman" w:eastAsia="Times New Roman" w:hAnsi="Times New Roman"/>
-          <w:sz w:val="24"/>
-          <w:szCs w:val="24"/>
-          <w:rtl w:val="0"/>
-        </w:rPr>
-        <w:t xml:space="preserve">z(Y) = (87 - 80) / 5</w:t>
-      </w:r>
-    </w:p>
-    <w:p>
-      <w:pPr>
-        <w:rPr>
-          <w:rFonts w:ascii="Times New Roman" w:cs="Times New Roman" w:eastAsia="Times New Roman" w:hAnsi="Times New Roman"/>
-          <w:sz w:val="24"/>
-          <w:szCs w:val="24"/>
-        </w:rPr>
-      </w:pPr>
-      <w:r>
-        <w:rPr>
-          <w:rFonts w:ascii="Times New Roman" w:cs="Times New Roman" w:eastAsia="Times New Roman" w:hAnsi="Times New Roman"/>
-          <w:sz w:val="24"/>
-          <w:szCs w:val="24"/>
-          <w:rtl w:val="0"/>
-        </w:rPr>
-        <w:t xml:space="preserve">= 1.40</w:t>
-      </w:r>
-    </w:p>
-    <w:p>
-      <w:pPr>
-        <w:rPr>
-          <w:rFonts w:ascii="Times New Roman" w:cs="Times New Roman" w:eastAsia="Times New Roman" w:hAnsi="Times New Roman"/>
-          <w:sz w:val="24"/>
-          <w:szCs w:val="24"/>
-        </w:rPr>
-      </w:pPr>
-    </w:p>
-    <w:p>
-      <w:pPr>
-        <w:rPr>
-          <w:rFonts w:ascii="Times New Roman" w:cs="Times New Roman" w:eastAsia="Times New Roman" w:hAnsi="Times New Roman"/>
-          <w:sz w:val="24"/>
-          <w:szCs w:val="24"/>
-        </w:rPr>
-      </w:pPr>
-      <w:r>
-        <w:rPr>
-          <w:rFonts w:ascii="Times New Roman" w:cs="Times New Roman" w:eastAsia="Times New Roman" w:hAnsi="Times New Roman"/>
-          <w:sz w:val="24"/>
-          <w:szCs w:val="24"/>
-          <w:rtl w:val="0"/>
-        </w:rPr>
-        <w:t xml:space="preserve">The student did better on Exam X relative to the other students. 84 is 1.5 standard deviations above the mean, compared to 1.4 on Exam Y, even though the raw score on Y was higher.</w:t>
-      </w:r>
-    </w:p>
-    <w:p>
-      <w:pPr>
-        <w:rPr>
-          <w:rFonts w:ascii="Times New Roman" w:cs="Times New Roman" w:eastAsia="Times New Roman" w:hAnsi="Times New Roman"/>
-          <w:sz w:val="24"/>
-          <w:szCs w:val="24"/>
-        </w:rPr>
-      </w:pPr>
-    </w:p>
-    <w:p>
-      <w:pPr>
-        <w:rPr>
-          <w:rFonts w:ascii="Times New Roman" w:cs="Times New Roman" w:eastAsia="Times New Roman" w:hAnsi="Times New Roman"/>
-          <w:sz w:val="24"/>
-          <w:szCs w:val="24"/>
-        </w:rPr>
-      </w:pPr>
-      <w:r>
-        <w:rPr>
-          <w:rFonts w:ascii="Times New Roman" w:cs="Times New Roman" w:eastAsia="Times New Roman" w:hAnsi="Times New Roman"/>
-          <w:sz w:val="24"/>
-          <w:szCs w:val="24"/>
-          <w:rtl w:val="0"/>
-        </w:rPr>
-        <w:t xml:space="preserve">3. P(64 ≤ X ≤ 88)</w:t>
-      </w:r>
-    </w:p>
-    <w:p>
-      <w:pPr>
-        <w:rPr>
-          <w:rFonts w:ascii="Times New Roman" w:cs="Times New Roman" w:eastAsia="Times New Roman" w:hAnsi="Times New Roman"/>
-          <w:sz w:val="24"/>
-          <w:szCs w:val="24"/>
-        </w:rPr>
-      </w:pPr>
-      <w:r>
-        <w:rPr>
-          <w:rFonts w:ascii="Times New Roman" w:cs="Times New Roman" w:eastAsia="Times New Roman" w:hAnsi="Times New Roman"/>
-          <w:sz w:val="24"/>
-          <w:szCs w:val="24"/>
-          <w:rtl w:val="0"/>
-        </w:rPr>
-        <w:t xml:space="preserve">z at 64 = (64 - 72) / 8 = -1</w:t>
-      </w:r>
-    </w:p>
-    <w:p>
-      <w:pPr>
-        <w:rPr>
-          <w:rFonts w:ascii="Times New Roman" w:cs="Times New Roman" w:eastAsia="Times New Roman" w:hAnsi="Times New Roman"/>
-          <w:sz w:val="24"/>
-          <w:szCs w:val="24"/>
-        </w:rPr>
-      </w:pPr>
-      <w:r>
-        <w:rPr>
-          <w:rFonts w:ascii="Times New Roman" w:cs="Times New Roman" w:eastAsia="Times New Roman" w:hAnsi="Times New Roman"/>
-          <w:sz w:val="24"/>
-          <w:szCs w:val="24"/>
-          <w:rtl w:val="0"/>
-        </w:rPr>
-        <w:t xml:space="preserve">z at 88 = (88 - 72) / 8 = 2</w:t>
-      </w:r>
-    </w:p>
-    <w:p>
-      <w:pPr>
-        <w:rPr>
-          <w:rFonts w:ascii="Times New Roman" w:cs="Times New Roman" w:eastAsia="Times New Roman" w:hAnsi="Times New Roman"/>
-          <w:sz w:val="24"/>
-          <w:szCs w:val="24"/>
-        </w:rPr>
-      </w:pPr>
-      <w:r>
-        <w:rPr>
-          <w:rFonts w:ascii="Times New Roman" w:cs="Times New Roman" w:eastAsia="Times New Roman" w:hAnsi="Times New Roman"/>
-          <w:sz w:val="24"/>
-          <w:szCs w:val="24"/>
-          <w:rtl w:val="0"/>
-        </w:rPr>
-        <w:t xml:space="preserve">P(64 ≤ X ≤ 88) = P(-1 ≤ Z ≤ 2)</w:t>
-      </w:r>
-    </w:p>
-    <w:p>
-      <w:pPr>
-        <w:rPr>
-          <w:rFonts w:ascii="Times New Roman" w:cs="Times New Roman" w:eastAsia="Times New Roman" w:hAnsi="Times New Roman"/>
-          <w:sz w:val="24"/>
-          <w:szCs w:val="24"/>
-        </w:rPr>
-      </w:pPr>
-      <w:r>
-        <w:rPr>
-          <w:rFonts w:ascii="Times New Roman" w:cs="Times New Roman" w:eastAsia="Times New Roman" w:hAnsi="Times New Roman"/>
-          <w:sz w:val="24"/>
-          <w:szCs w:val="24"/>
-          <w:rtl w:val="0"/>
-        </w:rPr>
-        <w:t xml:space="preserve">= Φ(2) - Φ(-1)</w:t>
-      </w:r>
-    </w:p>
-    <w:p>
-      <w:pPr>
-        <w:rPr>
-          <w:rFonts w:ascii="Times New Roman" w:cs="Times New Roman" w:eastAsia="Times New Roman" w:hAnsi="Times New Roman"/>
-          <w:sz w:val="24"/>
-          <w:szCs w:val="24"/>
-        </w:rPr>
-      </w:pPr>
-      <w:r>
-        <w:rPr>
-          <w:rFonts w:ascii="Times New Roman" w:cs="Times New Roman" w:eastAsia="Times New Roman" w:hAnsi="Times New Roman"/>
-          <w:sz w:val="24"/>
-          <w:szCs w:val="24"/>
-          <w:rtl w:val="0"/>
-        </w:rPr>
-        <w:t xml:space="preserve">= 0.9772 - 0.1587</w:t>
-      </w:r>
-    </w:p>
-    <w:p>
-      <w:pPr>
-        <w:rPr>
-          <w:rFonts w:ascii="Times New Roman" w:cs="Times New Roman" w:eastAsia="Times New Roman" w:hAnsi="Times New Roman"/>
-          <w:sz w:val="24"/>
-          <w:szCs w:val="24"/>
-        </w:rPr>
-      </w:pPr>
-      <w:r>
-        <w:rPr>
-          <w:rFonts w:ascii="Times New Roman" w:cs="Times New Roman" w:eastAsia="Times New Roman" w:hAnsi="Times New Roman"/>
-          <w:sz w:val="24"/>
-          <w:szCs w:val="24"/>
-          <w:rtl w:val="0"/>
-        </w:rPr>
-        <w:t xml:space="preserve">= 0.8185</w:t>
-      </w:r>
-    </w:p>
-    <w:p>
-      <w:pPr>
-        <w:rPr>
-          <w:rFonts w:ascii="Times New Roman" w:cs="Times New Roman" w:eastAsia="Times New Roman" w:hAnsi="Times New Roman"/>
-          <w:sz w:val="24"/>
-          <w:szCs w:val="24"/>
-        </w:rPr>
-      </w:pPr>
-    </w:p>
-    <w:p>
-      <w:pPr>
-        <w:rPr>
-          <w:rFonts w:ascii="Times New Roman" w:cs="Times New Roman" w:eastAsia="Times New Roman" w:hAnsi="Times New Roman"/>
-          <w:sz w:val="24"/>
-          <w:szCs w:val="24"/>
-        </w:rPr>
-      </w:pPr>
-      <w:r>
-        <w:rPr>
-          <w:rFonts w:ascii="Times New Roman" w:cs="Times New Roman" w:eastAsia="Times New Roman" w:hAnsi="Times New Roman"/>
-          <w:sz w:val="24"/>
-          <w:szCs w:val="24"/>
-          <w:rtl w:val="0"/>
-        </w:rPr>
-        <w:t xml:space="preserve">4. P(Y ≥ 90) and P(Y = 90)</w:t>
-      </w:r>
-    </w:p>
-    <w:p>
-      <w:pPr>
-        <w:rPr>
-          <w:rFonts w:ascii="Times New Roman" w:cs="Times New Roman" w:eastAsia="Times New Roman" w:hAnsi="Times New Roman"/>
-          <w:sz w:val="24"/>
-          <w:szCs w:val="24"/>
-        </w:rPr>
-      </w:pPr>
-      <w:r>
-        <w:rPr>
-          <w:rFonts w:ascii="Times New Roman" w:cs="Times New Roman" w:eastAsia="Times New Roman" w:hAnsi="Times New Roman"/>
-          <w:sz w:val="24"/>
-          <w:szCs w:val="24"/>
-          <w:rtl w:val="0"/>
-        </w:rPr>
-        <w:t xml:space="preserve">P(Y ≥ 90) = P(Z ≥ (90 - 80) / 5)</w:t>
-      </w:r>
-    </w:p>
-    <w:p>
-      <w:pPr>
-        <w:rPr>
-          <w:rFonts w:ascii="Times New Roman" w:cs="Times New Roman" w:eastAsia="Times New Roman" w:hAnsi="Times New Roman"/>
-          <w:sz w:val="24"/>
-          <w:szCs w:val="24"/>
-        </w:rPr>
-      </w:pPr>
-      <w:r>
-        <w:rPr>
-          <w:rFonts w:ascii="Times New Roman" w:cs="Times New Roman" w:eastAsia="Times New Roman" w:hAnsi="Times New Roman"/>
-          <w:sz w:val="24"/>
-          <w:szCs w:val="24"/>
-          <w:rtl w:val="0"/>
-        </w:rPr>
-        <w:t xml:space="preserve">= P(Z ≥ 2)</w:t>
-      </w:r>
-    </w:p>
-    <w:p>
-      <w:pPr>
-        <w:rPr>
-          <w:rFonts w:ascii="Times New Roman" w:cs="Times New Roman" w:eastAsia="Times New Roman" w:hAnsi="Times New Roman"/>
-          <w:sz w:val="24"/>
-          <w:szCs w:val="24"/>
-        </w:rPr>
-      </w:pPr>
-      <w:r>
-        <w:rPr>
-          <w:rFonts w:ascii="Times New Roman" w:cs="Times New Roman" w:eastAsia="Times New Roman" w:hAnsi="Times New Roman"/>
-          <w:sz w:val="24"/>
-          <w:szCs w:val="24"/>
-          <w:rtl w:val="0"/>
-        </w:rPr>
-        <w:t xml:space="preserve">= 1 - Φ(2)</w:t>
-      </w:r>
-    </w:p>
-    <w:p>
-      <w:pPr>
-        <w:rPr>
-          <w:rFonts w:ascii="Times New Roman" w:cs="Times New Roman" w:eastAsia="Times New Roman" w:hAnsi="Times New Roman"/>
-          <w:sz w:val="24"/>
-          <w:szCs w:val="24"/>
-        </w:rPr>
-      </w:pPr>
-      <w:r>
-        <w:rPr>
-          <w:rFonts w:ascii="Times New Roman" w:cs="Times New Roman" w:eastAsia="Times New Roman" w:hAnsi="Times New Roman"/>
-          <w:sz w:val="24"/>
-          <w:szCs w:val="24"/>
-          <w:rtl w:val="0"/>
-        </w:rPr>
-        <w:t xml:space="preserve">= 1 - 0.9772</w:t>
-      </w:r>
-    </w:p>
-    <w:p>
-      <w:pPr>
-        <w:rPr>
-          <w:rFonts w:ascii="Times New Roman" w:cs="Times New Roman" w:eastAsia="Times New Roman" w:hAnsi="Times New Roman"/>
-          <w:sz w:val="24"/>
-          <w:szCs w:val="24"/>
-        </w:rPr>
-      </w:pPr>
-      <w:r>
-        <w:rPr>
-          <w:rFonts w:ascii="Times New Roman" w:cs="Times New Roman" w:eastAsia="Times New Roman" w:hAnsi="Times New Roman"/>
-          <w:sz w:val="24"/>
-          <w:szCs w:val="24"/>
-          <w:rtl w:val="0"/>
-        </w:rPr>
-        <w:t xml:space="preserve">= 0.0228</w:t>
-      </w:r>
-    </w:p>
-    <w:p>
-      <w:pPr>
-        <w:rPr>
-          <w:rFonts w:ascii="Times New Roman" w:cs="Times New Roman" w:eastAsia="Times New Roman" w:hAnsi="Times New Roman"/>
-          <w:sz w:val="24"/>
-          <w:szCs w:val="24"/>
-        </w:rPr>
-      </w:pPr>
-    </w:p>
-    <w:p>
-      <w:pPr>
-        <w:rPr>
-          <w:rFonts w:ascii="Times New Roman" w:cs="Times New Roman" w:eastAsia="Times New Roman" w:hAnsi="Times New Roman"/>
-          <w:sz w:val="24"/>
-          <w:szCs w:val="24"/>
-        </w:rPr>
-      </w:pPr>
-      <w:r>
-        <w:rPr>
-          <w:rFonts w:ascii="Times New Roman" w:cs="Times New Roman" w:eastAsia="Times New Roman" w:hAnsi="Times New Roman"/>
-          <w:sz w:val="24"/>
-          <w:szCs w:val="24"/>
-          <w:rtl w:val="0"/>
-        </w:rPr>
-        <w:t xml:space="preserve">P(Y = 90) = 0</w:t>
-      </w:r>
-    </w:p>
-    <w:p>
-      <w:pPr>
-        <w:rPr>
-          <w:rFonts w:ascii="Times New Roman" w:cs="Times New Roman" w:eastAsia="Times New Roman" w:hAnsi="Times New Roman"/>
-          <w:sz w:val="24"/>
-          <w:szCs w:val="24"/>
-        </w:rPr>
-      </w:pPr>
-    </w:p>
-    <w:p>
-      <w:pPr>
-        <w:rPr>
-          <w:rFonts w:ascii="Times New Roman" w:cs="Times New Roman" w:eastAsia="Times New Roman" w:hAnsi="Times New Roman"/>
-          <w:sz w:val="24"/>
-          <w:szCs w:val="24"/>
-        </w:rPr>
-      </w:pPr>
-      <w:r>
-        <w:rPr>
-          <w:rFonts w:ascii="Times New Roman" w:cs="Times New Roman" w:eastAsia="Times New Roman" w:hAnsi="Times New Roman"/>
-          <w:sz w:val="24"/>
-          <w:szCs w:val="24"/>
-          <w:rtl w:val="0"/>
-        </w:rPr>
-        <w:t xml:space="preserve">Y is a continuous random variable, so probabilities are areas under the density curve. The interval from 90 up has width, so it has positive area (0.0228). A single point like exactly 90 has no width, so the area above it, and therefore its probability, is 0.</w:t>
-      </w:r>
-    </w:p>
-    <w:p>
-      <w:pPr>
-        <w:rPr>
-          <w:rFonts w:ascii="Times New Roman" w:cs="Times New Roman" w:eastAsia="Times New Roman" w:hAnsi="Times New Roman"/>
-          <w:sz w:val="24"/>
-          <w:szCs w:val="24"/>
-        </w:rPr>
-      </w:pPr>
+        <w:t xml:space="preserve">4. </w:t>
+      </w:r>
     </w:p>
     <w:p>
       <w:r>

</xml_diff>